<commit_message>
docs: generate System Design Document (md + docx) for Epic 2998
</commit_message>
<xml_diff>
--- a/docs/architecture/epic-2998/System-Design-Document.docx
+++ b/docs/architecture/epic-2998/System-Design-Document.docx
@@ -8,7 +8,7 @@
         <w:jc w:val="center"/>
       </w:pPr>
       <w:r>
-        <w:t>System Design Document - Online Railway Ticketing System (Epic 2998)</w:t>
+        <w:t>System Design Document - Online Railway Ticketing System</w:t>
       </w:r>
     </w:p>
     <w:p>
@@ -33,6 +33,58 @@
         <w:pStyle w:val="Heading1"/>
       </w:pPr>
       <w:r>
+        <w:t>System Design Document - Online Railway Ticketing System</w:t>
+      </w:r>
+    </w:p>
+    <w:p>
+      <w:r>
+        <w:rPr>
+          <w:b/>
+        </w:rPr>
+        <w:t>Source Requirement:</w:t>
+      </w:r>
+      <w:r>
+        <w:t xml:space="preserve"> Azure DevOps Epic 2998 - Online Railway Ticketing System</w:t>
+      </w:r>
+    </w:p>
+    <w:p>
+      <w:r>
+        <w:rPr>
+          <w:b/>
+        </w:rPr>
+        <w:t>Source ID:</w:t>
+      </w:r>
+      <w:r>
+        <w:t xml:space="preserve"> 2998</w:t>
+      </w:r>
+    </w:p>
+    <w:p>
+      <w:r>
+        <w:rPr>
+          <w:b/>
+        </w:rPr>
+        <w:t>Repository:</w:t>
+      </w:r>
+      <w:r>
+        <w:t xml:space="preserve"> Mandeep-Kaur-Johar/sdlc-online-railway-ticketing-system</w:t>
+      </w:r>
+    </w:p>
+    <w:p>
+      <w:r>
+        <w:rPr>
+          <w:b/>
+        </w:rPr>
+        <w:t>Architecture Folder:</w:t>
+      </w:r>
+      <w:r>
+        <w:t xml:space="preserve"> docs/architecture/epic-2998/</w:t>
+      </w:r>
+    </w:p>
+    <w:p>
+      <w:pPr>
+        <w:pStyle w:val="Heading1"/>
+      </w:pPr>
+      <w:r>
         <w:t>1. Introduction</w:t>
       </w:r>
     </w:p>
@@ -46,7 +98,12 @@
     </w:p>
     <w:p>
       <w:r>
-        <w:t>Passengers today lack a single, reliable online channel to search trains, reserve seats, pay, and manage the full ticket lifecycle for the Online Railway Ticketing System (Azure DevOps Epic 2998). This System Design Document defines the implementation-ready design for a platform that supports train search, seat availability, booking, passenger profile management, online payment, cancellation and refund, notifications, and customer support, as described in Features 2999, 3002, 3005, and 3008.</w:t>
+        <w:t>Passengers today lack a single reliable digital channel to search trains, reserve seats, pay securely, manage ticket lifecycle events, and obtain support, which drives counter queues, abandoned bookings and high support cost. Epic 2998 - Online Railway Ticketing System delivers a platform for searching trains, booking railway tickets, payments, ticket management, notifications and customer support, so that passengers complete an end-to-end journey purchase online without manual intervention.</w:t>
+      </w:r>
+    </w:p>
+    <w:p>
+      <w:r>
+        <w:t>The system consolidates four business capabilities defined in the backlog: Train Search and Availability (Feature 2999), Booking and Passenger Management (Feature 3002), Payments and Ticket Lifecycle (Feature 3005), and Notifications and Support (Feature 3008). Each capability is realised by a dedicated service boundary so that search traffic peaks do not degrade payment or booking reliability. The design keeps seat inventory authoritative in a single transactional store while serving read-heavy search traffic from a cache, which is the principal performance decision of this document.</w:t>
       </w:r>
     </w:p>
     <w:p>
@@ -57,7 +114,7 @@
         <w:t>Business Impact &amp; Key Decisions:</w:t>
       </w:r>
       <w:r>
-        <w:t xml:space="preserve"> Delivering a self-service digital booking channel reduces counter load, increases confirmed-booking conversion, and gives the railway operator auditable records of every reservation, payment, refund, and support interaction. The key architectural decision is a layered React + ASP.NET Core (.NET 8) solution on Azure App Service backed by a single transactional Azure SQL Database, chosen because the booking, payment, and refund flows require strong consistency on seat inventory rather than eventual consistency.</w:t>
+        <w:t xml:space="preserve"> Moving booking online reduces counter dependency and shortens time-to-ticket; separating payment settlement from seat reservation through an idempotent, event-driven confirmation flow prevents the most expensive failure mode in ticketing systems - money captured without a confirmed seat.</w:t>
       </w:r>
     </w:p>
     <w:p>
@@ -69,73 +126,58 @@
       </w:r>
     </w:p>
     <w:p>
-      <w:pPr>
-        <w:pStyle w:val="ListBullet"/>
-      </w:pPr>
       <w:r>
         <w:rPr>
           <w:b/>
         </w:rPr>
-        <w:t>Functional Scope</w:t>
+        <w:t>Functional Scope:</w:t>
       </w:r>
       <w:r>
-        <w:t>: Train search between source and destination stations with schedules and fares (Story 3000), seat availability by travel class refreshed against current inventory (Story 3001), multi-passenger booking with seat reservation and booking reference generation (Story 3003), saved passenger profiles with create/update/select (Story 3004), online payment where only successful payments confirm tickets (Story 3006), cancellation with policy-based refund calculation and visible cancellation status (Story 3007), booking/cancellation/schedule-change notifications over email and SMS (Story 3009), and logged, tracked support requests through closure (Story 3010).</w:t>
+        <w:t xml:space="preserve"> Train search by source, destination and date with schedules and fares (User Story 3000); seat availability by travel class refreshed against current inventory (User Story 3001); ticket booking for one or more passengers with seat reservation and booking reference generation (User Story 3003); saved passenger profiles for faster booking (User Story 3004); online payment through supported payment methods where only successful payments confirm bookings (User Story 3006); ticket cancellation with policy-based refund calculation and visible cancellation status (User Story 3007); booking, cancellation and schedule-change notifications by email and SMS (User Story 3009); and logged, tracked support requests maintained until closure (User Story 3010).</w:t>
       </w:r>
     </w:p>
     <w:p>
-      <w:pPr>
-        <w:pStyle w:val="ListBullet"/>
-      </w:pPr>
       <w:r>
         <w:rPr>
           <w:b/>
         </w:rPr>
-        <w:t>Non-Functional Scope</w:t>
+        <w:t>Non-Functional Scope:</w:t>
       </w:r>
       <w:r>
-        <w:t>: HTTPS-only transport using TLS 1.2 or higher, JSON Web Token (JWT) authentication, role-based authorization for Passenger and Support Agent roles, secret storage in Azure Key Vault, telemetry in Application Insights and Log Analytics, PCI DSS-aligned payment handling in which no raw card data is stored by this system, and personally identifiable information (PII) protection for passenger name, age, gender, email, and phone number.</w:t>
+        <w:t xml:space="preserve"> HTTPS-only transport with Transport Layer Security (TLS) 1.2 or higher, token-based authentication for the frontend using JSON Web Tokens (JWT), role and permission checks enforced in the backend, encryption at rest for all passenger and payment-reference data, Payment Card Industry Data Security Standard (PCI DSS) scope minimisation by never storing raw card data, personally identifiable information (PII) tagging and retention controls, and full audit logging of booking, payment and refund state transitions.</w:t>
       </w:r>
     </w:p>
     <w:p>
-      <w:pPr>
-        <w:pStyle w:val="ListBullet"/>
-      </w:pPr>
       <w:r>
         <w:rPr>
           <w:b/>
         </w:rPr>
-        <w:t>In-Scope Integrations</w:t>
+        <w:t>In-Scope Integrations:</w:t>
       </w:r>
       <w:r>
-        <w:t>: External Payment Gateway over REST/HTTPS for authorization, capture, and refund; external Email/SMS Provider over REST/HTTPS for notification delivery; Azure Key Vault for secrets; Application Insights for telemetry.</w:t>
+        <w:t xml:space="preserve"> An external payment service provider (PSP) invoked over HTTPS with signed webhook callbacks for settlement confirmation; an email and Short Message Service (SMS) provider for passenger notifications; Azure Service Bus for asynchronous booking-event propagation; Azure Key Vault for secrets; and Application Insights with Log Analytics for observability.</w:t>
       </w:r>
     </w:p>
     <w:p>
-      <w:pPr>
-        <w:pStyle w:val="ListBullet"/>
-      </w:pPr>
       <w:r>
         <w:rPr>
           <w:b/>
         </w:rPr>
-        <w:t>Out-of-Scope Items</w:t>
+        <w:t>Out-of-Scope Items:</w:t>
       </w:r>
       <w:r>
-        <w:t>: Native iOS and Android mobile applications, railway operations and train scheduling master-data administration consoles, dynamic fare/yield pricing engines, loyalty programs, seat-map graphical selection, and offline or counter-based ticket sales. These are excluded because no Feature or User Story under Epic 2998 requires them.</w:t>
+        <w:t xml:space="preserve"> Native mobile applications (the responsive React web client is the only delivered front end), railway operator timetable authoring tools, loyalty or fare-discount engines, third-party travel-agent reseller APIs, and offline or counter point-of-sale terminals. None of these appear in any Feature or User Story under Epic 2998 and they are therefore explicitly excluded.</w:t>
       </w:r>
     </w:p>
     <w:p>
-      <w:pPr>
-        <w:pStyle w:val="ListBullet"/>
-      </w:pPr>
       <w:r>
         <w:rPr>
           <w:b/>
         </w:rPr>
-        <w:t>Assumptions &amp; Constraints</w:t>
+        <w:t>Assumptions &amp; Constraints:</w:t>
       </w:r>
       <w:r>
-        <w:t>: Train, station, schedule, travel-class, and fare master data is loaded into the Azure SQL Database by an upstream railway master-data process (assumption, because no story defines master-data maintenance). A merchant account with a PCI DSS compliant payment gateway supporting hosted payment pages and refund APIs is available. The refund policy slab table is supplied by the business and is configuration-driven rather than hard-coded.</w:t>
+        <w:t xml:space="preserve"> The backlog does not name a specific payment provider, so the design assumes a tokenised, redirect-or-iframe PSP integration with webhook settlement (assumption). Timetable and route master data are assumed to be loaded into the platform's own schedule store from an operator feed (assumption). Azure is assumed as the hosting platform per baseline governance. Refund percentages are policy-driven and configurable because the backlog states only that refunds are calculated per policy.</w:t>
       </w:r>
     </w:p>
     <w:p>
@@ -148,17 +190,12 @@
     </w:p>
     <w:p>
       <w:r>
-        <w:t>The program follows an Agile Scrum delivery model with two-week sprints, where Epic 2998 decomposes into four Features and eight User Stories that are sized, refined, and pulled into sprints with their acceptance criteria as the definition of done. Design work is governed by a lightweight review process: this System Design Document is reviewed by the architecture, security, and QA leads before the first implementation sprint, and every material change is captured as an Architecture Decision Record (ADR) stored alongside this document in the repository. Tooling consists of Azure DevOps for the Epic/Feature/Story hierarchy and traceability, GitHub for source code, Mermaid-rendered PNG diagrams and this document, GitHub Actions for continuous integration and deployment, and Azure Monitor for post-release validation. Diagrams are generated as Mermaid source (</w:t>
+        <w:t>Delivery follows Agile Scrum with two-week sprints aligned to the four Features of Epic 2998, with each sprint producing a deployable increment behind feature flags. Design review is performed as an architecture review board checkpoint before each Feature enters development, and every significant choice recorded in Section 4 and Section 7 is captured as an Architecture Decision Record (ADR) stored alongside this document in docs/architecture/epic-2998/. Work items remain the system of record in Azure DevOps; code, diagrams and this document are the system of record in GitHub. Diagrams are authored as Mermaid sources, rendered to Portable Network Graphics (PNG) and committed with the document so that every reviewer sees the same version-controlled picture.</w:t>
       </w:r>
+    </w:p>
+    <w:p>
       <w:r>
-        <w:rPr>
-          <w:rFonts w:ascii="Consolas" w:hAnsi="Consolas"/>
-          <w:sz w:val="18"/>
-        </w:rPr>
-        <w:t>.mmd</w:t>
-      </w:r>
-      <w:r>
-        <w:t>) and rendered to PNG so that both human-readable images and version-controlled, diff-able source are retained.</w:t>
+        <w:t>Traceability is maintained bidirectionally: each component in Section 2 names the Feature or User Story it satisfies, and Section 8 restates the mapping as a matrix. Changes to acceptance criteria trigger a document revision rather than an informal update, keeping the design deterministic and auditable across the Business Analyst, Architect, Developer and Quality Assurance (QA) handoffs.</w:t>
       </w:r>
     </w:p>
     <w:p>
@@ -179,7 +216,17 @@
     </w:p>
     <w:p>
       <w:r>
-        <w:t>The solution uses a classic layered architecture with four logical tiers. The presentation tier is a React with TypeScript single-page application hosted on Azure Static Web Apps, containing the Train Search UI, Booking UI, Passenger Profile UI, Payment UI, and Support Request UI. The security tier sits in front of every backend call: JWT Authentication validates the bearer token issued at sign-in, and Role-Based Authorization enforces that Passengers may only act on their own bookings while Support Agents may read bookings linked to support requests. The application tier is an ASP.NET Core (.NET 8) Web API exposing six functional API groups - Train Search API, Booking API, Passenger Profile API, Payment API, Notification API, and Support API - each delegating to domain services that own business rules and to repositories that own persistence. The data tier is a single Azure SQL Database holding stations, trains, schedules, travel classes, seat inventory, user accounts, passenger profiles, bookings, booking passengers, payments, cancellations, notifications, and support requests. All browser-to-API and API-to-external traffic is HTTPS/JSON; API-to-database traffic uses the TDS protocol over an encrypted connection. The Payment API integrates with the external Payment Gateway and the Notification API integrates with the external Email/SMS Provider, both over REST/HTTPS with secrets retrieved from Azure Key Vault.</w:t>
+        <w:t>The solution is a layered, service-oriented architecture hosted on Azure. A React 18 single-page application written in TypeScript is delivered through Azure Static Web Apps and communicates only over HTTPS with a JWT bearer token. All traffic enters through Azure Application Gateway with Web Application Firewall (WAF) and is routed by an API gateway layer that applies rate limiting, request validation and correlation-identifier injection before dispatching to backend services.</w:t>
+      </w:r>
+    </w:p>
+    <w:p>
+      <w:r>
+        <w:t>Five .NET 8 ASP.NET Core services form the backend. The Search Service answers station-to-station queries and class-level availability (Features 2999); the Booking Service owns passenger profiles, seat reservation and booking references (Feature 3002); the Payment Service orchestrates payment intents, settlement webhooks, cancellation and refund calculation (Feature 3005); the Notification Service consumes booking events and dispatches email and SMS messages (Feature 3008); and the Support Service records and tracks support requests through to closure (User Story 3010).</w:t>
+      </w:r>
+    </w:p>
+    <w:p>
+      <w:r>
+        <w:t>Azure SQL Database is the transactional system of record for trains, schedules, seat inventory, bookings, tickets, payments, refunds and support tickets. Azure Cache for Redis fronts search and availability reads with a short time-to-live so that availability remains near-current while absorbing read peaks. Azure Service Bus carries booking, cancellation and schedule-change events to the Notification Service, decoupling passenger-facing latency from provider delivery latency. Secrets are held in Azure Key Vault and referenced by managed identity; telemetry flows to Application Insights and Log Analytics.</w:t>
       </w:r>
     </w:p>
     <w:p>
@@ -249,27 +296,78 @@
     </w:p>
     <w:p>
       <w:r>
-        <w:t>![Solution Architecture](solution-architecture.png)</w:t>
+        <w:rPr>
+          <w:b/>
+        </w:rPr>
+        <w:t>Caption:</w:t>
+      </w:r>
+      <w:r>
+        <w:t xml:space="preserve"> The solution architecture diagram shows the end-to-end logical view - browser to gateway, gateway to the five domain services, services to the transactional database, cache and message bus, and outward integration to the payment and communications providers. Its business meaning is that search load, booking transactions and payment settlement are isolated from one another so a failure or spike in one capability cannot block ticket issuance in another.</w:t>
       </w:r>
     </w:p>
     <w:p>
+      <w:pPr>
+        <w:jc w:val="center"/>
+      </w:pPr>
       <w:r>
-        <w:t>*Caption - Solution Architecture:* Shows how a passenger request flows from the React UI through the JWT authentication and role-based authorization layer into the six .NET 8 API groups, down to the Azure SQL Database, and outward to the Payment Gateway and Email/SMS Provider. Its business meaning is that no booking, payment, or refund can occur without an authenticated and authorized identity, and that every money-moving action is isolated in the Payment API where gateway credentials from Key Vault are used.</w:t>
+        <w:drawing>
+          <wp:inline xmlns:a="http://schemas.openxmlformats.org/drawingml/2006/main" xmlns:pic="http://schemas.openxmlformats.org/drawingml/2006/picture">
+            <wp:extent cx="5760720" cy="484721"/>
+            <wp:docPr id="2" name="Picture 2"/>
+            <wp:cNvGraphicFramePr>
+              <a:graphicFrameLocks noChangeAspect="1"/>
+            </wp:cNvGraphicFramePr>
+            <a:graphic>
+              <a:graphicData uri="http://schemas.openxmlformats.org/drawingml/2006/picture">
+                <pic:pic>
+                  <pic:nvPicPr>
+                    <pic:cNvPr id="0" name="image.png"/>
+                    <pic:cNvPicPr/>
+                  </pic:nvPicPr>
+                  <pic:blipFill>
+                    <a:blip r:embed="rId10"/>
+                    <a:stretch>
+                      <a:fillRect/>
+                    </a:stretch>
+                  </pic:blipFill>
+                  <pic:spPr>
+                    <a:xfrm>
+                      <a:off x="0" y="0"/>
+                      <a:ext cx="5760720" cy="484721"/>
+                    </a:xfrm>
+                    <a:prstGeom prst="rect"/>
+                  </pic:spPr>
+                </pic:pic>
+              </a:graphicData>
+            </a:graphic>
+          </wp:inline>
+        </w:drawing>
       </w:r>
     </w:p>
     <w:p>
-      <w:r>
-        <w:t xml:space="preserve">*Textual description (fallback):* The passenger reaches a React UI over HTTPS; every API call carries a JWT that is validated and role-checked before reaching any of the six API groups; five API groups persist to one Azure SQL Database; the Payment API alone talks to the Payment Gateway and the Notification API alone talks to the Email/SMS Provider. The Mermaid source is version controlled at </w:t>
-      </w:r>
+      <w:pPr>
+        <w:jc w:val="center"/>
+      </w:pPr>
       <w:r>
         <w:rPr>
-          <w:rFonts w:ascii="Consolas" w:hAnsi="Consolas"/>
+          <w:b/>
+          <w:i/>
           <w:sz w:val="18"/>
         </w:rPr>
-        <w:t>docs/architecture/epic-2998/solution-architecture.mmd</w:t>
+        <w:t>Component Diagram</w:t>
       </w:r>
+    </w:p>
+    <w:p>
+      <w:pPr>
+        <w:jc w:val="center"/>
+      </w:pPr>
       <w:r>
-        <w:t>.</w:t>
+        <w:rPr>
+          <w:i/>
+          <w:color w:val="646464"/>
+          <w:sz w:val="16"/>
+        </w:rPr>
+        <w:t>Source artifact: docs/architecture/epic-2998/component-diagram.png</w:t>
       </w:r>
     </w:p>
     <w:p>
@@ -277,30 +375,21 @@
         <w:rPr>
           <w:b/>
         </w:rPr>
-        <w:t>System Context:</w:t>
+        <w:t>Caption:</w:t>
       </w:r>
       <w:r>
-        <w:t xml:space="preserve"> The system's external boundary consists of two human actors (Passenger, Support Agent) and two external systems (Payment Gateway, Email/SMS Provider).</w:t>
+        <w:t xml:space="preserve"> The component diagram decomposes each service into controllers, application services, domain logic and repositories, making the implementation boundaries explicit for the Developer handoff.</w:t>
       </w:r>
     </w:p>
     <w:p>
       <w:r>
-        <w:t>![System Context](system-context.png)</w:t>
-      </w:r>
-    </w:p>
-    <w:p>
-      <w:r>
-        <w:t xml:space="preserve">*Caption - System Context:* Establishes that the Online Railway Ticketing System is the single system of record for bookings while money movement and message delivery are delegated to external providers, which bounds the compliance surface for PCI DSS and for telecom/email deliverability. Mermaid source: </w:t>
+        <w:rPr>
+          <w:b/>
+        </w:rPr>
+        <w:t>Fallback:</w:t>
       </w:r>
       <w:r>
-        <w:rPr>
-          <w:rFonts w:ascii="Consolas" w:hAnsi="Consolas"/>
-          <w:sz w:val="18"/>
-        </w:rPr>
-        <w:t>docs/architecture/epic-2998/system-context.mmd</w:t>
-      </w:r>
-      <w:r>
-        <w:t>.</w:t>
+        <w:t xml:space="preserve"> If images cannot be rendered, the architecture is: Browser (React/TypeScript) to Application Gateway (WAF, TLS 1.2+) to API Gateway (JWT validation, 100 requests per second limit) to {Search, Booking, Payment, Notification, Support} services; Search and Booking read/write Azure SQL; Search reads Azure Cache for Redis; Booking publishes to Azure Service Bus topic booking-events consumed by Notification; Payment calls the external PSP over HTTPS and receives signed webhooks; all services emit telemetry to Application Insights.</w:t>
       </w:r>
     </w:p>
     <w:p>
@@ -321,312 +410,22 @@
     </w:p>
     <w:p>
       <w:r>
-        <w:t xml:space="preserve">The backend is organized as Controllers to Domain Services to Repositories to Azure SQL Database, which keeps HTTP concerns, business rules, and persistence independently testable. The controller layer contains </w:t>
-      </w:r>
-      <w:r>
-        <w:rPr>
-          <w:rFonts w:ascii="Consolas" w:hAnsi="Consolas"/>
-          <w:sz w:val="18"/>
-        </w:rPr>
-        <w:t>TrainSearchController</w:t>
-      </w:r>
-      <w:r>
-        <w:t xml:space="preserve">, </w:t>
-      </w:r>
-      <w:r>
-        <w:rPr>
-          <w:rFonts w:ascii="Consolas" w:hAnsi="Consolas"/>
-          <w:sz w:val="18"/>
-        </w:rPr>
-        <w:t>BookingController</w:t>
-      </w:r>
-      <w:r>
-        <w:t xml:space="preserve">, </w:t>
-      </w:r>
-      <w:r>
-        <w:rPr>
-          <w:rFonts w:ascii="Consolas" w:hAnsi="Consolas"/>
-          <w:sz w:val="18"/>
-        </w:rPr>
-        <w:t>PassengerProfileController</w:t>
-      </w:r>
-      <w:r>
-        <w:t xml:space="preserve">, </w:t>
-      </w:r>
-      <w:r>
-        <w:rPr>
-          <w:rFonts w:ascii="Consolas" w:hAnsi="Consolas"/>
-          <w:sz w:val="18"/>
-        </w:rPr>
-        <w:t>PaymentController</w:t>
-      </w:r>
-      <w:r>
-        <w:t xml:space="preserve">, </w:t>
-      </w:r>
-      <w:r>
-        <w:rPr>
-          <w:rFonts w:ascii="Consolas" w:hAnsi="Consolas"/>
-          <w:sz w:val="18"/>
-        </w:rPr>
-        <w:t>NotificationController</w:t>
-      </w:r>
-      <w:r>
-        <w:t xml:space="preserve">, and </w:t>
-      </w:r>
-      <w:r>
-        <w:rPr>
-          <w:rFonts w:ascii="Consolas" w:hAnsi="Consolas"/>
-          <w:sz w:val="18"/>
-        </w:rPr>
-        <w:t>SupportController</w:t>
-      </w:r>
-      <w:r>
-        <w:t xml:space="preserve">, each performing model validation and mapping to data transfer objects (DTOs). The domain service layer contains </w:t>
-      </w:r>
-      <w:r>
-        <w:rPr>
-          <w:rFonts w:ascii="Consolas" w:hAnsi="Consolas"/>
-          <w:sz w:val="18"/>
-        </w:rPr>
-        <w:t>TrainSearchService</w:t>
-      </w:r>
-      <w:r>
-        <w:t xml:space="preserve"> (matches trains by source station, destination station, and travel date and returns schedules and fares per Story 3000), </w:t>
-      </w:r>
-      <w:r>
-        <w:rPr>
-          <w:rFonts w:ascii="Consolas" w:hAnsi="Consolas"/>
-          <w:sz w:val="18"/>
-        </w:rPr>
-        <w:t>SeatAvailabilityService</w:t>
-      </w:r>
-      <w:r>
-        <w:t xml:space="preserve"> (returns available seats per travel class from </w:t>
-      </w:r>
-      <w:r>
-        <w:rPr>
-          <w:rFonts w:ascii="Consolas" w:hAnsi="Consolas"/>
-          <w:sz w:val="18"/>
-        </w:rPr>
-        <w:t>SEAT_INVENTORY</w:t>
-      </w:r>
-      <w:r>
-        <w:t xml:space="preserve">, per Story 3001), </w:t>
-      </w:r>
-      <w:r>
-        <w:rPr>
-          <w:rFonts w:ascii="Consolas" w:hAnsi="Consolas"/>
-          <w:sz w:val="18"/>
-        </w:rPr>
-        <w:t>BookingService</w:t>
-      </w:r>
-      <w:r>
-        <w:t xml:space="preserve"> (validates passengers, reserves seats, generates a booking reference, per Story 3003), </w:t>
-      </w:r>
-      <w:r>
-        <w:rPr>
-          <w:rFonts w:ascii="Consolas" w:hAnsi="Consolas"/>
-          <w:sz w:val="18"/>
-        </w:rPr>
-        <w:t>PassengerService</w:t>
-      </w:r>
-      <w:r>
-        <w:t xml:space="preserve"> (create/update/select saved profiles, per Story 3004), </w:t>
-      </w:r>
-      <w:r>
-        <w:rPr>
-          <w:rFonts w:ascii="Consolas" w:hAnsi="Consolas"/>
-          <w:sz w:val="18"/>
-        </w:rPr>
-        <w:t>PaymentService</w:t>
-      </w:r>
-      <w:r>
-        <w:t xml:space="preserve"> (orchestrates gateway authorization and confirms or releases the booking, per Story 3006), </w:t>
-      </w:r>
-      <w:r>
-        <w:rPr>
-          <w:rFonts w:ascii="Consolas" w:hAnsi="Consolas"/>
-          <w:sz w:val="18"/>
-        </w:rPr>
-        <w:t>RefundService</w:t>
-      </w:r>
-      <w:r>
-        <w:t xml:space="preserve"> (applies the configurable refund-policy slab and records refund status, per Story 3007), </w:t>
-      </w:r>
-      <w:r>
-        <w:rPr>
-          <w:rFonts w:ascii="Consolas" w:hAnsi="Consolas"/>
-          <w:sz w:val="18"/>
-        </w:rPr>
-        <w:t>NotificationService</w:t>
-      </w:r>
-      <w:r>
-        <w:t xml:space="preserve"> (composes and dispatches email and SMS for booking, cancellation, and schedule change, per Story 3009), and </w:t>
-      </w:r>
-      <w:r>
-        <w:rPr>
-          <w:rFonts w:ascii="Consolas" w:hAnsi="Consolas"/>
-          <w:sz w:val="18"/>
-        </w:rPr>
-        <w:t>SupportService</w:t>
-      </w:r>
-      <w:r>
-        <w:t xml:space="preserve"> (logs, tracks, and closes support requests, per Story 3010). The repository layer uses Entity Framework Core 8 with explicit transactions.</w:t>
+        <w:t>Each backend service uses a consistent layering of API controllers, application services, domain entities and Entity Framework Core repositories, which keeps business rules out of transport code and makes unit testing straightforward. The Search Service exposes GET /api/v1/trains/search with source, destination and travel-date parameters returning train number, schedule, stops, class-wise fare and availability, satisfying the acceptance criterion that matching trains with schedules and fares are displayed. Results are cached in Redis under a composite key of origin, destination and date with a 60-second time-to-live, and availability counters are invalidated immediately on any reservation or cancellation commit so displayed availability reflects current inventory as required by User Story 3001.</w:t>
       </w:r>
     </w:p>
     <w:p>
       <w:r>
-        <w:t xml:space="preserve">Key algorithms and contracts: seat reservation uses a pessimistic concurrency pattern - a single SQL transaction performs </w:t>
+        <w:t>The Booking Service exposes POST /api/v1/bookings, which validates passenger payloads (one or more passengers per booking), takes a row-level pessimistic lock on the seat-inventory record for the requested train, date and class, decrements the available count inside a single database transaction, persists passenger rows and returns a generated human-readable booking reference such as RLY-2998-000123. Passenger profile management is served by GET, POST and PUT on /api/v1/passenger-profiles so that saved profiles can be created, updated and selected at booking time per User Story 3004. Every write endpoint accepts an Idempotency-Key header; a replayed key returns the original result instead of creating a duplicate booking.</w:t>
       </w:r>
+    </w:p>
+    <w:p>
       <w:r>
-        <w:rPr>
-          <w:rFonts w:ascii="Consolas" w:hAnsi="Consolas"/>
-          <w:sz w:val="18"/>
-        </w:rPr>
-        <w:t>UPDATE SEAT_INVENTORY SET AvailableSeats = AvailableSeats - @n WHERE SeatInventoryId = @id AND AvailableSeats &gt;= @n</w:t>
+        <w:t>The Payment Service creates a payment intent against the PSP, holds the booking in a Pending state, and only transitions the booking to Confirmed and issues a ticket when a signature-verified settlement webhook or a successful server-side verification is received - directly enforcing the acceptance criterion that failed payments do not create confirmed tickets. Pending bookings that receive no settlement within 15 minutes are expired by a background reconciliation job that releases the held seats back to inventory. Cancellation calls POST /api/v1/tickets/{id}/cancel, evaluates the configurable refund-policy table by hours-before-departure band, writes a Refund record and exposes cancellation status to the passenger, satisfying User Story 3007.</w:t>
       </w:r>
+    </w:p>
+    <w:p>
       <w:r>
-        <w:t xml:space="preserve">, and a zero-row result raises a </w:t>
-      </w:r>
-      <w:r>
-        <w:rPr>
-          <w:rFonts w:ascii="Consolas" w:hAnsi="Consolas"/>
-          <w:sz w:val="18"/>
-        </w:rPr>
-        <w:t>SeatUnavailableException</w:t>
-      </w:r>
-      <w:r>
-        <w:t xml:space="preserve"> that returns HTTP 409 Conflict, which prevents overbooking without distributed locks. The booking reference is a 10-character uppercase alphanumeric code generated from a cryptographically secure random source and persisted under a unique index. The refund amount is computed as </w:t>
-      </w:r>
-      <w:r>
-        <w:rPr>
-          <w:rFonts w:ascii="Consolas" w:hAnsi="Consolas"/>
-          <w:sz w:val="18"/>
-        </w:rPr>
-        <w:t>RefundAmount = TotalFare - CancellationCharge(slab)</w:t>
-      </w:r>
-      <w:r>
-        <w:t xml:space="preserve"> where the slab is selected by hours-to-departure from configuration. Representative API contracts are </w:t>
-      </w:r>
-      <w:r>
-        <w:rPr>
-          <w:rFonts w:ascii="Consolas" w:hAnsi="Consolas"/>
-          <w:sz w:val="18"/>
-        </w:rPr>
-        <w:t>GET /api/trains/search?source={code}&amp;destination={code}&amp;date={yyyy-MM-dd}</w:t>
-      </w:r>
-      <w:r>
-        <w:t xml:space="preserve">, </w:t>
-      </w:r>
-      <w:r>
-        <w:rPr>
-          <w:rFonts w:ascii="Consolas" w:hAnsi="Consolas"/>
-          <w:sz w:val="18"/>
-        </w:rPr>
-        <w:t>GET /api/schedules/{scheduleId}/availability</w:t>
-      </w:r>
-      <w:r>
-        <w:t xml:space="preserve">, </w:t>
-      </w:r>
-      <w:r>
-        <w:rPr>
-          <w:rFonts w:ascii="Consolas" w:hAnsi="Consolas"/>
-          <w:sz w:val="18"/>
-        </w:rPr>
-        <w:t>POST /api/bookings</w:t>
-      </w:r>
-      <w:r>
-        <w:t xml:space="preserve">, </w:t>
-      </w:r>
-      <w:r>
-        <w:rPr>
-          <w:rFonts w:ascii="Consolas" w:hAnsi="Consolas"/>
-          <w:sz w:val="18"/>
-        </w:rPr>
-        <w:t>GET /api/bookings/{bookingReference}</w:t>
-      </w:r>
-      <w:r>
-        <w:t xml:space="preserve">, </w:t>
-      </w:r>
-      <w:r>
-        <w:rPr>
-          <w:rFonts w:ascii="Consolas" w:hAnsi="Consolas"/>
-          <w:sz w:val="18"/>
-        </w:rPr>
-        <w:t>POST /api/payments</w:t>
-      </w:r>
-      <w:r>
-        <w:t xml:space="preserve">, </w:t>
-      </w:r>
-      <w:r>
-        <w:rPr>
-          <w:rFonts w:ascii="Consolas" w:hAnsi="Consolas"/>
-          <w:sz w:val="18"/>
-        </w:rPr>
-        <w:t>POST /api/bookings/{bookingReference}/cancel</w:t>
-      </w:r>
-      <w:r>
-        <w:t xml:space="preserve">, </w:t>
-      </w:r>
-      <w:r>
-        <w:rPr>
-          <w:rFonts w:ascii="Consolas" w:hAnsi="Consolas"/>
-          <w:sz w:val="18"/>
-        </w:rPr>
-        <w:t>GET|POST|PUT /api/passenger-profiles</w:t>
-      </w:r>
-      <w:r>
-        <w:t xml:space="preserve">, and </w:t>
-      </w:r>
-      <w:r>
-        <w:rPr>
-          <w:rFonts w:ascii="Consolas" w:hAnsi="Consolas"/>
-          <w:sz w:val="18"/>
-        </w:rPr>
-        <w:t>POST /api/support-requests</w:t>
-      </w:r>
-      <w:r>
-        <w:t xml:space="preserve">. Error handling is centralized in an exception-handling middleware that emits RFC 7807 </w:t>
-      </w:r>
-      <w:r>
-        <w:rPr>
-          <w:rFonts w:ascii="Consolas" w:hAnsi="Consolas"/>
-          <w:sz w:val="18"/>
-        </w:rPr>
-        <w:t>application/problem+json</w:t>
-      </w:r>
-      <w:r>
-        <w:t xml:space="preserve"> responses and never leaks stack traces or gateway credentials. Idempotency is enforced by requiring an </w:t>
-      </w:r>
-      <w:r>
-        <w:rPr>
-          <w:rFonts w:ascii="Consolas" w:hAnsi="Consolas"/>
-          <w:sz w:val="18"/>
-        </w:rPr>
-        <w:t>Idempotency-Key</w:t>
-      </w:r>
-      <w:r>
-        <w:t xml:space="preserve"> header on </w:t>
-      </w:r>
-      <w:r>
-        <w:rPr>
-          <w:rFonts w:ascii="Consolas" w:hAnsi="Consolas"/>
-          <w:sz w:val="18"/>
-        </w:rPr>
-        <w:t>POST /api/bookings</w:t>
-      </w:r>
-      <w:r>
-        <w:t xml:space="preserve"> and </w:t>
-      </w:r>
-      <w:r>
-        <w:rPr>
-          <w:rFonts w:ascii="Consolas" w:hAnsi="Consolas"/>
-          <w:sz w:val="18"/>
-        </w:rPr>
-        <w:t>POST /api/payments</w:t>
-      </w:r>
-      <w:r>
-        <w:t>; a replayed key returns the original result instead of double-charging. Outbound gateway and notification calls use Polly with three retries and exponential backoff (2s, 4s, 8s) plus a circuit breaker that opens after five consecutive failures. Caching applies only to slow-changing reference data - station and train master data is cached in-memory for 60 minutes and invalidated on master-data refresh - while seat availability is never cached because Story 3001 requires current inventory.</w:t>
+        <w:t>Error handling is standardised on RFC 7807 problem-detail responses with a correlation identifier echoed in every response header and log entry. Transient downstream failures use Polly-based retry with exponential backoff (three attempts, base delay 200 milliseconds) plus a circuit breaker that opens after five consecutive failures for 30 seconds, preventing retry storms against the PSP or communications provider. Notification dispatch is at-least-once with provider-side deduplication keys, and failed messages after retry exhaustion land on a dead-letter queue monitored by an alert rule.</w:t>
       </w:r>
     </w:p>
     <w:p>
@@ -637,7 +436,7 @@
         <w:drawing>
           <wp:inline xmlns:a="http://schemas.openxmlformats.org/drawingml/2006/main" xmlns:pic="http://schemas.openxmlformats.org/drawingml/2006/picture">
             <wp:extent cx="5760720" cy="484721"/>
-            <wp:docPr id="2" name="Picture 2"/>
+            <wp:docPr id="3" name="Picture 3"/>
             <wp:cNvGraphicFramePr>
               <a:graphicFrameLocks noChangeAspect="1"/>
             </wp:cNvGraphicFramePr>
@@ -691,27 +490,7 @@
           <w:color w:val="646464"/>
           <w:sz w:val="16"/>
         </w:rPr>
-        <w:t>Source artifact: docs/architecture/epic-2998/sequence.png</w:t>
-      </w:r>
-    </w:p>
-    <w:p>
-      <w:r>
-        <w:t>![Critical Workflow Sequence](sequence-booking-payment.png)</w:t>
-      </w:r>
-    </w:p>
-    <w:p>
-      <w:r>
-        <w:t xml:space="preserve">*Caption - Critical Workflow Sequence:* Traces the end-to-end search, book, pay, confirm and notify flow, including the failure branch. It matters commercially because it encodes the rule from Story 3006 that failed payments must never produce a confirmed ticket and must release held seats back to inventory. Mermaid source: </w:t>
-      </w:r>
-      <w:r>
-        <w:rPr>
-          <w:rFonts w:ascii="Consolas" w:hAnsi="Consolas"/>
-          <w:sz w:val="18"/>
-        </w:rPr>
-        <w:t>docs/architecture/epic-2998/sequence-booking-payment.mmd</w:t>
-      </w:r>
-      <w:r>
-        <w:t>.</w:t>
+        <w:t>Source artifact: docs/architecture/epic-2998/sequence-booking-payment.png</w:t>
       </w:r>
     </w:p>
     <w:p>
@@ -719,27 +498,10 @@
         <w:rPr>
           <w:b/>
         </w:rPr>
-        <w:t>Component Decomposition:</w:t>
-      </w:r>
-    </w:p>
-    <w:p>
-      <w:r>
-        <w:t>![Component Diagram](component-diagram.png)</w:t>
-      </w:r>
-    </w:p>
-    <w:p>
-      <w:r>
-        <w:t xml:space="preserve">*Caption - Component Diagram:* Maps each UI module to its controller, domain service, and repository so that a developer can pick up any User Story and know exactly which classes to create or modify. Mermaid source: </w:t>
+        <w:t>Caption:</w:t>
       </w:r>
       <w:r>
-        <w:rPr>
-          <w:rFonts w:ascii="Consolas" w:hAnsi="Consolas"/>
-          <w:sz w:val="18"/>
-        </w:rPr>
-        <w:t>docs/architecture/epic-2998/component-diagram.mmd</w:t>
-      </w:r>
-      <w:r>
-        <w:t>.</w:t>
+        <w:t xml:space="preserve"> The sequence diagram traces the critical booking-and-payment workflow from search through seat hold, payment intent, PSP settlement, ticket issuance and notification, including the failure branch where payment is declined and the held seat is released. It matters because this single path carries all revenue and all seat-inventory correctness risk.</w:t>
       </w:r>
     </w:p>
     <w:p>
@@ -747,177 +509,10 @@
         <w:rPr>
           <w:b/>
         </w:rPr>
-        <w:t>Data Model:</w:t>
-      </w:r>
-    </w:p>
-    <w:p>
-      <w:r>
-        <w:t>![Data Model](data-model.png)</w:t>
-      </w:r>
-    </w:p>
-    <w:p>
-      <w:r>
-        <w:t xml:space="preserve">*Caption - Data Model:* Defines thirteen entities - </w:t>
+        <w:t>Fallback:</w:t>
       </w:r>
       <w:r>
-        <w:rPr>
-          <w:rFonts w:ascii="Consolas" w:hAnsi="Consolas"/>
-          <w:sz w:val="18"/>
-        </w:rPr>
-        <w:t>STATION</w:t>
-      </w:r>
-      <w:r>
-        <w:t xml:space="preserve">, </w:t>
-      </w:r>
-      <w:r>
-        <w:rPr>
-          <w:rFonts w:ascii="Consolas" w:hAnsi="Consolas"/>
-          <w:sz w:val="18"/>
-        </w:rPr>
-        <w:t>TRAIN</w:t>
-      </w:r>
-      <w:r>
-        <w:t xml:space="preserve">, </w:t>
-      </w:r>
-      <w:r>
-        <w:rPr>
-          <w:rFonts w:ascii="Consolas" w:hAnsi="Consolas"/>
-          <w:sz w:val="18"/>
-        </w:rPr>
-        <w:t>TRAIN_SCHEDULE</w:t>
-      </w:r>
-      <w:r>
-        <w:t xml:space="preserve">, </w:t>
-      </w:r>
-      <w:r>
-        <w:rPr>
-          <w:rFonts w:ascii="Consolas" w:hAnsi="Consolas"/>
-          <w:sz w:val="18"/>
-        </w:rPr>
-        <w:t>TRAVEL_CLASS</w:t>
-      </w:r>
-      <w:r>
-        <w:t xml:space="preserve">, </w:t>
-      </w:r>
-      <w:r>
-        <w:rPr>
-          <w:rFonts w:ascii="Consolas" w:hAnsi="Consolas"/>
-          <w:sz w:val="18"/>
-        </w:rPr>
-        <w:t>SEAT_INVENTORY</w:t>
-      </w:r>
-      <w:r>
-        <w:t xml:space="preserve">, </w:t>
-      </w:r>
-      <w:r>
-        <w:rPr>
-          <w:rFonts w:ascii="Consolas" w:hAnsi="Consolas"/>
-          <w:sz w:val="18"/>
-        </w:rPr>
-        <w:t>USER_ACCOUNT</w:t>
-      </w:r>
-      <w:r>
-        <w:t xml:space="preserve">, </w:t>
-      </w:r>
-      <w:r>
-        <w:rPr>
-          <w:rFonts w:ascii="Consolas" w:hAnsi="Consolas"/>
-          <w:sz w:val="18"/>
-        </w:rPr>
-        <w:t>PASSENGER_PROFILE</w:t>
-      </w:r>
-      <w:r>
-        <w:t xml:space="preserve">, </w:t>
-      </w:r>
-      <w:r>
-        <w:rPr>
-          <w:rFonts w:ascii="Consolas" w:hAnsi="Consolas"/>
-          <w:sz w:val="18"/>
-        </w:rPr>
-        <w:t>BOOKING</w:t>
-      </w:r>
-      <w:r>
-        <w:t xml:space="preserve">, </w:t>
-      </w:r>
-      <w:r>
-        <w:rPr>
-          <w:rFonts w:ascii="Consolas" w:hAnsi="Consolas"/>
-          <w:sz w:val="18"/>
-        </w:rPr>
-        <w:t>BOOKING_PASSENGER</w:t>
-      </w:r>
-      <w:r>
-        <w:t xml:space="preserve">, </w:t>
-      </w:r>
-      <w:r>
-        <w:rPr>
-          <w:rFonts w:ascii="Consolas" w:hAnsi="Consolas"/>
-          <w:sz w:val="18"/>
-        </w:rPr>
-        <w:t>PAYMENT</w:t>
-      </w:r>
-      <w:r>
-        <w:t xml:space="preserve">, </w:t>
-      </w:r>
-      <w:r>
-        <w:rPr>
-          <w:rFonts w:ascii="Consolas" w:hAnsi="Consolas"/>
-          <w:sz w:val="18"/>
-        </w:rPr>
-        <w:t>CANCELLATION</w:t>
-      </w:r>
-      <w:r>
-        <w:t xml:space="preserve">, </w:t>
-      </w:r>
-      <w:r>
-        <w:rPr>
-          <w:rFonts w:ascii="Consolas" w:hAnsi="Consolas"/>
-          <w:sz w:val="18"/>
-        </w:rPr>
-        <w:t>NOTIFICATION</w:t>
-      </w:r>
-      <w:r>
-        <w:t xml:space="preserve">, and </w:t>
-      </w:r>
-      <w:r>
-        <w:rPr>
-          <w:rFonts w:ascii="Consolas" w:hAnsi="Consolas"/>
-          <w:sz w:val="18"/>
-        </w:rPr>
-        <w:t>SUPPORT_REQUEST</w:t>
-      </w:r>
-      <w:r>
-        <w:t xml:space="preserve"> - which together cover every data requirement stated in the eight User Stories. </w:t>
-      </w:r>
-      <w:r>
-        <w:rPr>
-          <w:rFonts w:ascii="Consolas" w:hAnsi="Consolas"/>
-          <w:sz w:val="18"/>
-        </w:rPr>
-        <w:t>SEAT_INVENTORY</w:t>
-      </w:r>
-      <w:r>
-        <w:t xml:space="preserve"> is keyed by schedule and travel class so availability is answerable in one indexed read, and </w:t>
-      </w:r>
-      <w:r>
-        <w:rPr>
-          <w:rFonts w:ascii="Consolas" w:hAnsi="Consolas"/>
-          <w:sz w:val="18"/>
-        </w:rPr>
-        <w:t>BOOKING_PASSENGER</w:t>
-      </w:r>
-      <w:r>
-        <w:t xml:space="preserve"> resolves the many-to-many relationship that makes multi-passenger booking possible. Mermaid source: </w:t>
-      </w:r>
-      <w:r>
-        <w:rPr>
-          <w:rFonts w:ascii="Consolas" w:hAnsi="Consolas"/>
-          <w:sz w:val="18"/>
-        </w:rPr>
-        <w:t>docs/architecture/epic-2998/data-model.mmd</w:t>
-      </w:r>
-      <w:r>
-        <w:t>.</w:t>
+        <w:t xml:space="preserve"> Passenger to UI to Gateway to Booking Service (reserve seat, status Pending) to Payment Service (create intent) to PSP (authorise) to Payment Service (webhook verified) to Booking Service (confirm, issue ticket) to Service Bus to Notification Service (email and SMS). On decline, Payment Service returns failure, Booking Service releases the seat hold and the booking is marked Failed with no ticket issued.</w:t>
       </w:r>
     </w:p>
     <w:p/>
@@ -945,70 +540,10 @@
         <w:rPr>
           <w:b/>
         </w:rPr>
-        <w:t>Payment Gateway (REST/HTTPS)</w:t>
+        <w:t>Payment service provider (PSP) dependency:</w:t>
       </w:r>
       <w:r>
-        <w:t xml:space="preserve">: The Payment API calls </w:t>
-      </w:r>
-      <w:r>
-        <w:rPr>
-          <w:rFonts w:ascii="Consolas" w:hAnsi="Consolas"/>
-          <w:sz w:val="18"/>
-        </w:rPr>
-        <w:t>POST /authorize</w:t>
-      </w:r>
-      <w:r>
-        <w:t xml:space="preserve">, </w:t>
-      </w:r>
-      <w:r>
-        <w:rPr>
-          <w:rFonts w:ascii="Consolas" w:hAnsi="Consolas"/>
-          <w:sz w:val="18"/>
-        </w:rPr>
-        <w:t>POST /capture</w:t>
-      </w:r>
-      <w:r>
-        <w:t xml:space="preserve">, and </w:t>
-      </w:r>
-      <w:r>
-        <w:rPr>
-          <w:rFonts w:ascii="Consolas" w:hAnsi="Consolas"/>
-          <w:sz w:val="18"/>
-        </w:rPr>
-        <w:t>POST /refund</w:t>
-      </w:r>
-      <w:r>
-        <w:t xml:space="preserve"> with a JSON contract of </w:t>
-      </w:r>
-      <w:r>
-        <w:rPr>
-          <w:rFonts w:ascii="Consolas" w:hAnsi="Consolas"/>
-          <w:sz w:val="18"/>
-        </w:rPr>
-        <w:t>{bookingReference, amount, currency, idempotencyKey}</w:t>
-      </w:r>
-      <w:r>
-        <w:t xml:space="preserve"> and receives </w:t>
-      </w:r>
-      <w:r>
-        <w:rPr>
-          <w:rFonts w:ascii="Consolas" w:hAnsi="Consolas"/>
-          <w:sz w:val="18"/>
-        </w:rPr>
-        <w:t>{gatewayReference, status, failureCode}</w:t>
-      </w:r>
-      <w:r>
-        <w:t xml:space="preserve">. Authentication uses a merchant API key plus HMAC-SHA256 request signing, with the key stored in Azure Key Vault secret </w:t>
-      </w:r>
-      <w:r>
-        <w:rPr>
-          <w:rFonts w:ascii="Consolas" w:hAnsi="Consolas"/>
-          <w:sz w:val="18"/>
-        </w:rPr>
-        <w:t>payment-gateway-api-key</w:t>
-      </w:r>
-      <w:r>
-        <w:t>. This matters because Story 3006 requires that only successful authorization confirms a booking.</w:t>
+        <w:t xml:space="preserve"> The Payment Service integrates over HTTPS using a tokenised payment intent API and a signed webhook callback; webhook signatures are verified with an HMAC-SHA256 secret held in Azure Key Vault, and unverified callbacks are rejected with HTTP 401 (this protects User Story 3006's rule that only successful payments confirm bookings). Integration checkpoint: 100 percent of settlement webhooks verified and reconciled within 15 minutes.</w:t>
       </w:r>
     </w:p>
     <w:p>
@@ -1019,30 +554,10 @@
         <w:rPr>
           <w:b/>
         </w:rPr>
-        <w:t>Email/SMS Provider (REST/HTTPS)</w:t>
+        <w:t>Notification provider dependency:</w:t>
       </w:r>
       <w:r>
-        <w:t xml:space="preserve">: The Notification API posts </w:t>
-      </w:r>
-      <w:r>
-        <w:rPr>
-          <w:rFonts w:ascii="Consolas" w:hAnsi="Consolas"/>
-          <w:sz w:val="18"/>
-        </w:rPr>
-        <w:t>{channel, recipient, templateId, mergeFields}</w:t>
-      </w:r>
-      <w:r>
-        <w:t xml:space="preserve"> to the provider and persists the returned message identifier in </w:t>
-      </w:r>
-      <w:r>
-        <w:rPr>
-          <w:rFonts w:ascii="Consolas" w:hAnsi="Consolas"/>
-          <w:sz w:val="18"/>
-        </w:rPr>
-        <w:t>NOTIFICATION.DeliveryStatus</w:t>
-      </w:r>
-      <w:r>
-        <w:t>. Three templates are required - booking confirmation, cancellation/refund, and schedule change - matching the three notification events in Story 3009. Delivery webhooks update status asynchronously so support staff can prove whether a passenger was notified.</w:t>
+        <w:t xml:space="preserve"> The Notification Service calls an email and SMS provider API for booking, cancellation and schedule-change messages (User Story 3009), using templates versioned in the repository; delivery receipts are persisted against the notification record. Integration checkpoint: 99 percent of confirmation messages dispatched within 60 seconds of ticket issuance.</w:t>
       </w:r>
     </w:p>
     <w:p>
@@ -1053,50 +568,10 @@
         <w:rPr>
           <w:b/>
         </w:rPr>
-        <w:t>Event flows</w:t>
+        <w:t>Internal asynchronous contract:</w:t>
       </w:r>
       <w:r>
-        <w:t>: Booking confirmation, cancellation, and schedule change raise internal domain events (</w:t>
-      </w:r>
-      <w:r>
-        <w:rPr>
-          <w:rFonts w:ascii="Consolas" w:hAnsi="Consolas"/>
-          <w:sz w:val="18"/>
-        </w:rPr>
-        <w:t>BookingConfirmed</w:t>
-      </w:r>
-      <w:r>
-        <w:t xml:space="preserve">, </w:t>
-      </w:r>
-      <w:r>
-        <w:rPr>
-          <w:rFonts w:ascii="Consolas" w:hAnsi="Consolas"/>
-          <w:sz w:val="18"/>
-        </w:rPr>
-        <w:t>BookingCancelled</w:t>
-      </w:r>
-      <w:r>
-        <w:t xml:space="preserve">, </w:t>
-      </w:r>
-      <w:r>
-        <w:rPr>
-          <w:rFonts w:ascii="Consolas" w:hAnsi="Consolas"/>
-          <w:sz w:val="18"/>
-        </w:rPr>
-        <w:t>ScheduleChanged</w:t>
-      </w:r>
-      <w:r>
-        <w:t xml:space="preserve">) consumed by </w:t>
-      </w:r>
-      <w:r>
-        <w:rPr>
-          <w:rFonts w:ascii="Consolas" w:hAnsi="Consolas"/>
-          <w:sz w:val="18"/>
-        </w:rPr>
-        <w:t>NotificationService</w:t>
-      </w:r>
-      <w:r>
-        <w:t xml:space="preserve"> through an outbox table, which guarantees a notification is never lost if the provider is briefly unavailable (dependency: provider uptime, see Section 7.2).</w:t>
+        <w:t xml:space="preserve"> Booking publishes BookingConfirmed, BookingCancelled and ScheduleChanged events to the Azure Service Bus topic booking-events with a JSON data contract containing bookingReference, ticketId, passengerContact and eventTimestamp; the Notification Service subscribes with a dedicated subscription and 10 maximum delivery attempts before dead-lettering.</w:t>
       </w:r>
     </w:p>
     <w:p>
@@ -1107,10 +582,10 @@
         <w:rPr>
           <w:b/>
         </w:rPr>
-        <w:t>Authentication methods</w:t>
+        <w:t>Authentication across boundaries:</w:t>
       </w:r>
       <w:r>
-        <w:t>: Browser-to-API uses JWT bearer tokens with a 60-minute access-token lifetime and a 7-day refresh token; API-to-gateway uses signed API keys; API-to-database uses an Azure Managed Identity so no SQL password exists in configuration.</w:t>
+        <w:t xml:space="preserve"> The browser presents a JWT bearer token (15-minute access token, 8-hour refresh token) validated at the API gateway; service-to-service and service-to-Azure-resource calls use Microsoft Entra managed identities with no shared secrets in configuration, satisfying the baseline token-based authentication and backend authorisation rule.</w:t>
       </w:r>
     </w:p>
     <w:p>
@@ -1121,10 +596,10 @@
         <w:rPr>
           <w:b/>
         </w:rPr>
-        <w:t>Measurable integration checkpoints</w:t>
+        <w:t>Data contracts and versioning:</w:t>
       </w:r>
       <w:r>
-        <w:t>: Gateway sandbox contract test suite must pass 100% before Week 5 integration testing; notification provider must demonstrate at least 99% delivery for a 500-message smoke batch; every external call must emit an Application Insights dependency telemetry record with correlation identifier; failed external calls must retry 3 times before being marked failed.</w:t>
+        <w:t xml:space="preserve"> All public endpoints are versioned under /api/v1 with JSON data transfer objects (DTOs); contract changes are additive only within a major version, and OpenAPI 3.0 specifications are generated at build time and published as pipeline artifacts so Developer and QA agents validate against the same contract.</w:t>
       </w:r>
     </w:p>
     <w:p>
@@ -1143,110 +618,10 @@
         <w:rPr>
           <w:b/>
         </w:rPr>
-        <w:t>Azure resources (named)</w:t>
+        <w:t>Named Azure resources:</w:t>
       </w:r>
       <w:r>
-        <w:t xml:space="preserve">: </w:t>
-      </w:r>
-      <w:r>
-        <w:rPr>
-          <w:rFonts w:ascii="Consolas" w:hAnsi="Consolas"/>
-          <w:sz w:val="18"/>
-        </w:rPr>
-        <w:t>app-railway-api-prod</w:t>
-      </w:r>
-      <w:r>
-        <w:t xml:space="preserve"> (Azure App Service, P1v3), </w:t>
-      </w:r>
-      <w:r>
-        <w:rPr>
-          <w:rFonts w:ascii="Consolas" w:hAnsi="Consolas"/>
-          <w:sz w:val="18"/>
-        </w:rPr>
-        <w:t>swa-railway-ui-prod</w:t>
-      </w:r>
-      <w:r>
-        <w:t xml:space="preserve"> (Azure Static Web Apps), </w:t>
-      </w:r>
-      <w:r>
-        <w:rPr>
-          <w:rFonts w:ascii="Consolas" w:hAnsi="Consolas"/>
-          <w:sz w:val="18"/>
-        </w:rPr>
-        <w:t>sql-railway-prod</w:t>
-      </w:r>
-      <w:r>
-        <w:t xml:space="preserve"> with database </w:t>
-      </w:r>
-      <w:r>
-        <w:rPr>
-          <w:rFonts w:ascii="Consolas" w:hAnsi="Consolas"/>
-          <w:sz w:val="18"/>
-        </w:rPr>
-        <w:t>RailwayTicketingDb</w:t>
-      </w:r>
-      <w:r>
-        <w:t xml:space="preserve"> (Azure SQL, S3 tier), </w:t>
-      </w:r>
-      <w:r>
-        <w:rPr>
-          <w:rFonts w:ascii="Consolas" w:hAnsi="Consolas"/>
-          <w:sz w:val="18"/>
-        </w:rPr>
-        <w:t>kv-railway-prod</w:t>
-      </w:r>
-      <w:r>
-        <w:t xml:space="preserve"> (Azure Key Vault), </w:t>
-      </w:r>
-      <w:r>
-        <w:rPr>
-          <w:rFonts w:ascii="Consolas" w:hAnsi="Consolas"/>
-          <w:sz w:val="18"/>
-        </w:rPr>
-        <w:t>appi-railway-prod</w:t>
-      </w:r>
-      <w:r>
-        <w:t xml:space="preserve"> (Application Insights), </w:t>
-      </w:r>
-      <w:r>
-        <w:rPr>
-          <w:rFonts w:ascii="Consolas" w:hAnsi="Consolas"/>
-          <w:sz w:val="18"/>
-        </w:rPr>
-        <w:t>log-railway-prod</w:t>
-      </w:r>
-      <w:r>
-        <w:t xml:space="preserve"> (Log Analytics). Names are environment-suffixed (</w:t>
-      </w:r>
-      <w:r>
-        <w:rPr>
-          <w:rFonts w:ascii="Consolas" w:hAnsi="Consolas"/>
-          <w:sz w:val="18"/>
-        </w:rPr>
-        <w:t>-dev</w:t>
-      </w:r>
-      <w:r>
-        <w:t xml:space="preserve">, </w:t>
-      </w:r>
-      <w:r>
-        <w:rPr>
-          <w:rFonts w:ascii="Consolas" w:hAnsi="Consolas"/>
-          <w:sz w:val="18"/>
-        </w:rPr>
-        <w:t>-test</w:t>
-      </w:r>
-      <w:r>
-        <w:t xml:space="preserve">, </w:t>
-      </w:r>
-      <w:r>
-        <w:rPr>
-          <w:rFonts w:ascii="Consolas" w:hAnsi="Consolas"/>
-          <w:sz w:val="18"/>
-        </w:rPr>
-        <w:t>-prod</w:t>
-      </w:r>
-      <w:r>
-        <w:t>) so promotion is a parameter change, not a code change.</w:t>
+        <w:t xml:space="preserve"> Resource group rg-railway-ticketing-prod containing Azure SQL Database railwaydb (General Purpose, zone redundant), Azure Cache for Redis cache-railway (Standard C1), Azure Service Bus namespace sb-railway with topic booking-events, Azure Key Vault kv-railway and Application Insights appi-railway - each deployed per environment with a dev, qa or prod suffix.</w:t>
       </w:r>
     </w:p>
     <w:p>
@@ -1257,60 +632,10 @@
         <w:rPr>
           <w:b/>
         </w:rPr>
-        <w:t>Key Vault secrets</w:t>
+        <w:t>Application settings:</w:t>
       </w:r>
       <w:r>
-        <w:t xml:space="preserve">: </w:t>
-      </w:r>
-      <w:r>
-        <w:rPr>
-          <w:rFonts w:ascii="Consolas" w:hAnsi="Consolas"/>
-          <w:sz w:val="18"/>
-        </w:rPr>
-        <w:t>payment-gateway-api-key</w:t>
-      </w:r>
-      <w:r>
-        <w:t xml:space="preserve">, </w:t>
-      </w:r>
-      <w:r>
-        <w:rPr>
-          <w:rFonts w:ascii="Consolas" w:hAnsi="Consolas"/>
-          <w:sz w:val="18"/>
-        </w:rPr>
-        <w:t>payment-gateway-hmac-secret</w:t>
-      </w:r>
-      <w:r>
-        <w:t xml:space="preserve">, </w:t>
-      </w:r>
-      <w:r>
-        <w:rPr>
-          <w:rFonts w:ascii="Consolas" w:hAnsi="Consolas"/>
-          <w:sz w:val="18"/>
-        </w:rPr>
-        <w:t>notification-provider-api-key</w:t>
-      </w:r>
-      <w:r>
-        <w:t xml:space="preserve">, </w:t>
-      </w:r>
-      <w:r>
-        <w:rPr>
-          <w:rFonts w:ascii="Consolas" w:hAnsi="Consolas"/>
-          <w:sz w:val="18"/>
-        </w:rPr>
-        <w:t>jwt-signing-key</w:t>
-      </w:r>
-      <w:r>
-        <w:t xml:space="preserve">. No secret may appear in </w:t>
-      </w:r>
-      <w:r>
-        <w:rPr>
-          <w:rFonts w:ascii="Consolas" w:hAnsi="Consolas"/>
-          <w:sz w:val="18"/>
-        </w:rPr>
-        <w:t>appsettings.json</w:t>
-      </w:r>
-      <w:r>
-        <w:t>, environment files, or source control; the API reads them at startup via Managed Identity.</w:t>
+        <w:t xml:space="preserve"> ConnectionStrings:RailwayDb, Redis:ConnectionString, ServiceBus:FullyQualifiedNamespace, Payments:ProviderBaseUrl, Payments:WebhookSecretName, Notifications:ProviderBaseUrl and Jwt:Authority are mandatory; all secret values are Key Vault references resolved by managed identity, never literals in appsettings.json (no secret is ever committed to source control).</w:t>
       </w:r>
     </w:p>
     <w:p>
@@ -1321,90 +646,10 @@
         <w:rPr>
           <w:b/>
         </w:rPr>
-        <w:t>Application settings</w:t>
+        <w:t>Business configuration:</w:t>
       </w:r>
       <w:r>
-        <w:t xml:space="preserve">: </w:t>
-      </w:r>
-      <w:r>
-        <w:rPr>
-          <w:rFonts w:ascii="Consolas" w:hAnsi="Consolas"/>
-          <w:sz w:val="18"/>
-        </w:rPr>
-        <w:t>Jwt:Issuer</w:t>
-      </w:r>
-      <w:r>
-        <w:t xml:space="preserve">, </w:t>
-      </w:r>
-      <w:r>
-        <w:rPr>
-          <w:rFonts w:ascii="Consolas" w:hAnsi="Consolas"/>
-          <w:sz w:val="18"/>
-        </w:rPr>
-        <w:t>Jwt:Audience</w:t>
-      </w:r>
-      <w:r>
-        <w:t xml:space="preserve">, </w:t>
-      </w:r>
-      <w:r>
-        <w:rPr>
-          <w:rFonts w:ascii="Consolas" w:hAnsi="Consolas"/>
-          <w:sz w:val="18"/>
-        </w:rPr>
-        <w:t>Jwt:AccessTokenMinutes=60</w:t>
-      </w:r>
-      <w:r>
-        <w:t xml:space="preserve">, </w:t>
-      </w:r>
-      <w:r>
-        <w:rPr>
-          <w:rFonts w:ascii="Consolas" w:hAnsi="Consolas"/>
-          <w:sz w:val="18"/>
-        </w:rPr>
-        <w:t>Payment:TimeoutSeconds=30</w:t>
-      </w:r>
-      <w:r>
-        <w:t xml:space="preserve">, </w:t>
-      </w:r>
-      <w:r>
-        <w:rPr>
-          <w:rFonts w:ascii="Consolas" w:hAnsi="Consolas"/>
-          <w:sz w:val="18"/>
-        </w:rPr>
-        <w:t>Payment:RetryCount=3</w:t>
-      </w:r>
-      <w:r>
-        <w:t xml:space="preserve">, </w:t>
-      </w:r>
-      <w:r>
-        <w:rPr>
-          <w:rFonts w:ascii="Consolas" w:hAnsi="Consolas"/>
-          <w:sz w:val="18"/>
-        </w:rPr>
-        <w:t>Refund:PolicySlabs</w:t>
-      </w:r>
-      <w:r>
-        <w:t xml:space="preserve"> (JSON array of hours-to-departure thresholds and charge percentages), </w:t>
-      </w:r>
-      <w:r>
-        <w:rPr>
-          <w:rFonts w:ascii="Consolas" w:hAnsi="Consolas"/>
-          <w:sz w:val="18"/>
-        </w:rPr>
-        <w:t>Cache:MasterDataMinutes=60</w:t>
-      </w:r>
-      <w:r>
-        <w:t xml:space="preserve">, </w:t>
-      </w:r>
-      <w:r>
-        <w:rPr>
-          <w:rFonts w:ascii="Consolas" w:hAnsi="Consolas"/>
-          <w:sz w:val="18"/>
-        </w:rPr>
-        <w:t>ApplicationInsights:ConnectionString</w:t>
-      </w:r>
-      <w:r>
-        <w:t>.</w:t>
+        <w:t xml:space="preserve"> Refund policy bands (hours before departure to refund percentage), seat-hold timeout of 15 minutes, search cache time-to-live of 60 seconds, maximum passengers per booking of 6, and supported travel classes are held in a configuration table so policy changes require no redeployment.</w:t>
       </w:r>
     </w:p>
     <w:p>
@@ -1415,30 +660,10 @@
         <w:rPr>
           <w:b/>
         </w:rPr>
-        <w:t>Infrastructure as code</w:t>
+        <w:t>Infrastructure as code:</w:t>
       </w:r>
       <w:r>
-        <w:t xml:space="preserve">: All resources are declared in Bicep modules under </w:t>
-      </w:r>
-      <w:r>
-        <w:rPr>
-          <w:rFonts w:ascii="Consolas" w:hAnsi="Consolas"/>
-          <w:sz w:val="18"/>
-        </w:rPr>
-        <w:t>infra/</w:t>
-      </w:r>
-      <w:r>
-        <w:t xml:space="preserve"> and deployed through GitHub Actions; manual portal changes are prohibited, and drift is detected by a weekly </w:t>
-      </w:r>
-      <w:r>
-        <w:rPr>
-          <w:rFonts w:ascii="Consolas" w:hAnsi="Consolas"/>
-          <w:sz w:val="18"/>
-        </w:rPr>
-        <w:t>what-if</w:t>
-      </w:r>
-      <w:r>
-        <w:t xml:space="preserve"> run. Bicep state and parameter files are version controlled per environment.</w:t>
+        <w:t xml:space="preserve"> All resources are declared in Bicep modules under infra/ with environment-specific parameter files, state and deployments executed only through the pipeline service principal; manual portal changes are prohibited and detected by a nightly drift-check job.</w:t>
       </w:r>
     </w:p>
     <w:p>
@@ -1449,50 +674,10 @@
         <w:rPr>
           <w:b/>
         </w:rPr>
-        <w:t>Database configuration</w:t>
+        <w:t>Runtime and framework versions:</w:t>
       </w:r>
       <w:r>
-        <w:t xml:space="preserve">: Entity Framework Core 8 migrations are the only schema change mechanism; required indexes are </w:t>
-      </w:r>
-      <w:r>
-        <w:rPr>
-          <w:rFonts w:ascii="Consolas" w:hAnsi="Consolas"/>
-          <w:sz w:val="18"/>
-        </w:rPr>
-        <w:t>IX_TrainSchedule_TrainId_TravelDate</w:t>
-      </w:r>
-      <w:r>
-        <w:t xml:space="preserve">, </w:t>
-      </w:r>
-      <w:r>
-        <w:rPr>
-          <w:rFonts w:ascii="Consolas" w:hAnsi="Consolas"/>
-          <w:sz w:val="18"/>
-        </w:rPr>
-        <w:t>IX_SeatInventory_ScheduleId_TravelClassId</w:t>
-      </w:r>
-      <w:r>
-        <w:t xml:space="preserve">, </w:t>
-      </w:r>
-      <w:r>
-        <w:rPr>
-          <w:rFonts w:ascii="Consolas" w:hAnsi="Consolas"/>
-          <w:sz w:val="18"/>
-        </w:rPr>
-        <w:t>UX_Booking_BookingReference</w:t>
-      </w:r>
-      <w:r>
-        <w:t xml:space="preserve">, and </w:t>
-      </w:r>
-      <w:r>
-        <w:rPr>
-          <w:rFonts w:ascii="Consolas" w:hAnsi="Consolas"/>
-          <w:sz w:val="18"/>
-        </w:rPr>
-        <w:t>IX_SupportRequest_UserId_Status</w:t>
-      </w:r>
-      <w:r>
-        <w:t>. Point-in-time restore retention is set to 35 days.</w:t>
+        <w:t xml:space="preserve"> .NET 8 (long-term support) for all services, React 18 with TypeScript 5.x and Node.js 20 for the client, Entity Framework Core 8 for persistence, and container images based on mcr.microsoft.com/dotnet/aspnet:8.0 pinned by digest for reproducible builds.</w:t>
       </w:r>
     </w:p>
     <w:p>
@@ -1511,20 +696,10 @@
         <w:rPr>
           <w:b/>
         </w:rPr>
-        <w:t>Latency</w:t>
+        <w:t>Latency targets:</w:t>
       </w:r>
       <w:r>
-        <w:t>: Train search (</w:t>
-      </w:r>
-      <w:r>
-        <w:rPr>
-          <w:rFonts w:ascii="Consolas" w:hAnsi="Consolas"/>
-          <w:sz w:val="18"/>
-        </w:rPr>
-        <w:t>GET /api/trains/search</w:t>
-      </w:r>
-      <w:r>
-        <w:t>) must return in 800 ms or less at the 95th percentile for a single-day, single-route query; seat availability in 500 ms p95; booking creation in 1.5 s p95 excluding gateway time; payment confirmation in 5 s p95 including gateway round trip.</w:t>
+        <w:t xml:space="preserve"> Train search (User Story 3000) returns in under 500 milliseconds at the 95th percentile on a cache hit and under 1,200 milliseconds at the 95th percentile on a cache miss; booking creation completes in under 2 seconds at the 95th percentile excluding external PSP authorisation time.</w:t>
       </w:r>
     </w:p>
     <w:p>
@@ -1535,10 +710,10 @@
         <w:rPr>
           <w:b/>
         </w:rPr>
-        <w:t>Uptime</w:t>
+        <w:t>Availability targets:</w:t>
       </w:r>
       <w:r>
-        <w:t>: 99.9% monthly availability for search and booking endpoints (maximum approximately 43 minutes of unplanned downtime per 30-day month), measured by Application Insights availability tests executed every 5 minutes from three Azure regions.</w:t>
+        <w:t xml:space="preserve"> 99.9 percent monthly availability for search and booking endpoints and 99.95 percent for payment settlement callback processing, measured by synthetic availability tests running every 5 minutes from two Azure regions.</w:t>
       </w:r>
     </w:p>
     <w:p>
@@ -1549,10 +724,10 @@
         <w:rPr>
           <w:b/>
         </w:rPr>
-        <w:t>RTO/RPO</w:t>
+        <w:t>Recovery objectives:</w:t>
       </w:r>
       <w:r>
-        <w:t>: Recovery Time Objective is 4 hours and Recovery Point Objective is 15 minutes, achieved through Azure SQL automated backups with point-in-time restore and geo-redundant backup storage; a restore drill is executed once per quarter and the result recorded.</w:t>
+        <w:t xml:space="preserve"> Recovery Time Objective (RTO) of 60 minutes and Recovery Point Objective (RPO) of 15 minutes, supported by Azure SQL point-in-time restore with 35-day retention and geo-redundant backup; a documented restore drill is executed quarterly and its result recorded as evidence.</w:t>
       </w:r>
     </w:p>
     <w:p>
@@ -1563,10 +738,10 @@
         <w:rPr>
           <w:b/>
         </w:rPr>
-        <w:t>Maintenance windows</w:t>
+        <w:t>Maintenance and change windows:</w:t>
       </w:r>
       <w:r>
-        <w:t>: Planned maintenance occurs Sundays 02:00-04:00 UTC, announced 72 hours in advance; deployments outside this window must be zero-downtime slot swaps. Booking and payment endpoints are never taken offline during a window without a read-only maintenance page.</w:t>
+        <w:t xml:space="preserve"> Planned maintenance occurs Sundays 02:00-04:00 UTC with blue-green slot swaps so passenger-facing downtime is zero; emergency changes require Release Manager approval and a post-incident review within 3 business days.</w:t>
       </w:r>
     </w:p>
     <w:p>
@@ -1577,10 +752,10 @@
         <w:rPr>
           <w:b/>
         </w:rPr>
-        <w:t>Escalation SLAs</w:t>
+        <w:t>Escalation and support SLAs:</w:t>
       </w:r>
       <w:r>
-        <w:t>: Severity 1 (payments failing, booking unavailable) acknowledged within 15 minutes and mitigated within 4 hours; Severity 2 (notifications delayed, search degraded) acknowledged within 1 hour and resolved within 1 business day; support requests raised under Story 3010 receive a first response within 24 hours and are tracked until closure.</w:t>
+        <w:t xml:space="preserve"> Severity 1 (payments failing or booking unavailable) acknowledged within 15 minutes and mitigated within 4 hours; Severity 2 within 1 hour and 1 business day; passenger support requests raised under User Story 3010 receive first response within 8 business hours and are tracked to closure with status visible to the passenger.</w:t>
       </w:r>
     </w:p>
     <w:p>
@@ -1599,10 +774,10 @@
         <w:rPr>
           <w:b/>
         </w:rPr>
-        <w:t>Network segmentation</w:t>
+        <w:t>Network segmentation:</w:t>
       </w:r>
       <w:r>
-        <w:t>: The API is reachable only through Azure Front Door with a Web Application Firewall using the OWASP 3.2 managed rule set; the Azure SQL Database accepts connections only from the App Service subnet via a Private Endpoint and denies public network access.</w:t>
+        <w:t xml:space="preserve"> Public ingress terminates at Azure Application Gateway with WAF in prevention mode using the OWASP Core Rule Set 3.2; backend services run in a private virtual network subnet and reach Azure SQL, Redis, Service Bus and Key Vault exclusively over private endpoints with public network access disabled.</w:t>
       </w:r>
     </w:p>
     <w:p>
@@ -1613,10 +788,10 @@
         <w:rPr>
           <w:b/>
         </w:rPr>
-        <w:t>Encryption</w:t>
+        <w:t>Encryption standards:</w:t>
       </w:r>
       <w:r>
-        <w:t>: TLS 1.2 or higher is enforced for all inbound and outbound traffic (HTTP is redirected, not served); data at rest uses Azure SQL Transparent Data Encryption; PII columns holding email and phone number use Always Encrypted deterministic encryption so support queries remain possible.</w:t>
+        <w:t xml:space="preserve"> TLS 1.2 or higher is enforced for every external and internal hop with weaker cipher suites disabled; Azure SQL uses Transparent Data Encryption with Always Encrypted columns for passenger identity documents and contact details, and Redis is configured for in-transit encryption only with no PII cached.</w:t>
       </w:r>
     </w:p>
     <w:p>
@@ -1627,10 +802,10 @@
         <w:rPr>
           <w:b/>
         </w:rPr>
-        <w:t>Key rotation</w:t>
+        <w:t>Key and secret management:</w:t>
       </w:r>
       <w:r>
-        <w:t>: JWT signing keys rotate every 90 days with a 24-hour overlap window; payment gateway and notification provider keys rotate every 180 days or immediately on suspected compromise; rotation is automated through Key Vault versioned secrets with no application redeploy required.</w:t>
+        <w:t xml:space="preserve"> All secrets, webhook signing keys and connection strings live in Azure Key Vault with soft delete and purge protection enabled, 90-day automated rotation for application secrets, and access limited to service managed identities through role-based access control (no human standing access to production secrets).</w:t>
       </w:r>
     </w:p>
     <w:p>
@@ -1641,10 +816,10 @@
         <w:rPr>
           <w:b/>
         </w:rPr>
-        <w:t>Compliance mappings</w:t>
+        <w:t>Compliance mapping:</w:t>
       </w:r>
       <w:r>
-        <w:t>: Card data is never stored, logged, or transmitted through this system - the hosted gateway page collects it - which keeps the platform in PCI DSS SAQ-A scope. Passenger PII handling follows data-minimization and a purge of support attachments after 180 days; audit logs for booking, payment, cancellation, and refund are retained for 7 years for financial dispute resolution.</w:t>
+        <w:t xml:space="preserve"> Raw card data never touches the platform - the PSP is responsible for cardholder data, keeping the solution in PCI DSS SAQ-A scope; passenger PII is classified, tagged, retained for 7 years for ticketing and tax purposes then purged, and data-subject export and erasure requests are serviced through the Support Service workflow.</w:t>
       </w:r>
     </w:p>
     <w:p>
@@ -1655,20 +830,10 @@
         <w:rPr>
           <w:b/>
         </w:rPr>
-        <w:t>Policy enforcement</w:t>
+        <w:t>Policy enforcement and auditing:</w:t>
       </w:r>
       <w:r>
-        <w:t xml:space="preserve">: Role-Based Authorization restricts Passengers to their own </w:t>
-      </w:r>
-      <w:r>
-        <w:rPr>
-          <w:rFonts w:ascii="Consolas" w:hAnsi="Consolas"/>
-          <w:sz w:val="18"/>
-        </w:rPr>
-        <w:t>USER_ACCOUNT</w:t>
-      </w:r>
-      <w:r>
-        <w:t xml:space="preserve"> scope and Support Agents to read-only booking access linked to an open support request; all privileged actions are written to an immutable audit log in Log Analytics; secret scanning, dependency scanning, and CodeQL run on every pull request and block merge on high-severity findings.</w:t>
+        <w:t xml:space="preserve"> Authorisation is enforced in every backend service by role (Passenger, SupportAgent, Administrator) and by resource ownership so a passenger can only read their own bookings; all booking, payment, refund and profile mutations write immutable audit entries with actor, correlation identifier and timestamp to Log Analytics with 365-day retention.</w:t>
       </w:r>
     </w:p>
     <w:p>
@@ -1687,30 +852,10 @@
         <w:rPr>
           <w:b/>
         </w:rPr>
-        <w:t>Booking workflow execution steps</w:t>
+        <w:t>Booking orchestration:</w:t>
       </w:r>
       <w:r>
-        <w:t xml:space="preserve">: search, select schedule and travel class, capture passengers, reserve seats (transactional decrement), create booking in </w:t>
-      </w:r>
-      <w:r>
-        <w:rPr>
-          <w:rFonts w:ascii="Consolas" w:hAnsi="Consolas"/>
-          <w:sz w:val="18"/>
-        </w:rPr>
-        <w:t>PendingPayment</w:t>
-      </w:r>
-      <w:r>
-        <w:t xml:space="preserve">, authorize payment, then confirm or release. Each step is a discrete, resumable state on </w:t>
-      </w:r>
-      <w:r>
-        <w:rPr>
-          <w:rFonts w:ascii="Consolas" w:hAnsi="Consolas"/>
-          <w:sz w:val="18"/>
-        </w:rPr>
-        <w:t>BOOKING.BookingStatus</w:t>
-      </w:r>
-      <w:r>
-        <w:t>, so an abandoned session can be reconciled rather than silently leaking inventory.</w:t>
+        <w:t xml:space="preserve"> The booking workflow executes reserve-seat, create-payment-intent, await-settlement, issue-ticket and publish-event as discrete, idempotent steps; each step is keyed by the Idempotency-Key header so a client retry or duplicate webhook can never double-book a seat or double-charge a passenger.</w:t>
       </w:r>
     </w:p>
     <w:p>
@@ -1721,40 +866,10 @@
         <w:rPr>
           <w:b/>
         </w:rPr>
-        <w:t>Orchestration tooling</w:t>
+        <w:t>Compensating actions:</w:t>
       </w:r>
       <w:r>
-        <w:t xml:space="preserve">: Orchestration is performed in-process by </w:t>
-      </w:r>
-      <w:r>
-        <w:rPr>
-          <w:rFonts w:ascii="Consolas" w:hAnsi="Consolas"/>
-          <w:sz w:val="18"/>
-        </w:rPr>
-        <w:t>BookingService</w:t>
-      </w:r>
-      <w:r>
-        <w:t xml:space="preserve"> and </w:t>
-      </w:r>
-      <w:r>
-        <w:rPr>
-          <w:rFonts w:ascii="Consolas" w:hAnsi="Consolas"/>
-          <w:sz w:val="18"/>
-        </w:rPr>
-        <w:t>PaymentService</w:t>
-      </w:r>
-      <w:r>
-        <w:t xml:space="preserve"> using database transactions plus an outbox table; a .NET </w:t>
-      </w:r>
-      <w:r>
-        <w:rPr>
-          <w:rFonts w:ascii="Consolas" w:hAnsi="Consolas"/>
-          <w:sz w:val="18"/>
-        </w:rPr>
-        <w:t>BackgroundService</w:t>
-      </w:r>
-      <w:r>
-        <w:t xml:space="preserve"> hosted worker drains the outbox every 30 seconds to dispatch notifications. No external workflow engine is introduced, which avoids added licensing cost and operational surface for an eight-story scope.</w:t>
+        <w:t xml:space="preserve"> If settlement fails or times out, a compensating release-seat action returns inventory and marks the booking Failed; if ticket issuance fails after a successful capture, the workflow raises a Severity 1 alert and queues an automatic refund rather than leaving money captured without a ticket.</w:t>
       </w:r>
     </w:p>
     <w:p>
@@ -1765,40 +880,10 @@
         <w:rPr>
           <w:b/>
         </w:rPr>
-        <w:t>Scheduled jobs</w:t>
+        <w:t>Scheduled jobs:</w:t>
       </w:r>
       <w:r>
-        <w:t xml:space="preserve">: An expiry job runs every 5 minutes to release seats held by bookings that remained in </w:t>
-      </w:r>
-      <w:r>
-        <w:rPr>
-          <w:rFonts w:ascii="Consolas" w:hAnsi="Consolas"/>
-          <w:sz w:val="18"/>
-        </w:rPr>
-        <w:t>PendingPayment</w:t>
-      </w:r>
-      <w:r>
-        <w:t xml:space="preserve"> for more than 15 minutes; a refund reconciliation job runs hourly to match </w:t>
-      </w:r>
-      <w:r>
-        <w:rPr>
-          <w:rFonts w:ascii="Consolas" w:hAnsi="Consolas"/>
-          <w:sz w:val="18"/>
-        </w:rPr>
-        <w:t>CANCELLATION.RefundStatus</w:t>
-      </w:r>
-      <w:r>
-        <w:t xml:space="preserve"> against gateway refund states; a schedule-change detection job runs daily at 01:00 UTC and raises </w:t>
-      </w:r>
-      <w:r>
-        <w:rPr>
-          <w:rFonts w:ascii="Consolas" w:hAnsi="Consolas"/>
-          <w:sz w:val="18"/>
-        </w:rPr>
-        <w:t>ScheduleChanged</w:t>
-      </w:r>
-      <w:r>
-        <w:t xml:space="preserve"> notifications.</w:t>
+        <w:t xml:space="preserve"> A pending-booking reconciliation job runs every 5 minutes to expire holds older than 15 minutes; a PSP settlement reconciliation job runs hourly to compare captured payments against confirmed bookings; and a schedule-change detection job runs every 30 minutes against the timetable feed to trigger ScheduleChanged notifications.</w:t>
       </w:r>
     </w:p>
     <w:p>
@@ -1809,10 +894,10 @@
         <w:rPr>
           <w:b/>
         </w:rPr>
-        <w:t>Retries and backoffs</w:t>
+        <w:t>Retry and backoff policy:</w:t>
       </w:r>
       <w:r>
-        <w:t>: External calls retry 3 times with exponential backoff of 2s, 4s, and 8s plus jitter; the outbox dispatcher retries a message up to 10 times over 24 hours before moving it to a dead-letter table with an alert; database deadlock victims retry twice before surfacing an error.</w:t>
+        <w:t xml:space="preserve"> Outbound calls to the PSP and the communications provider use three retries with exponential backoff (200 milliseconds, 400 milliseconds, 800 milliseconds) plus jitter, wrapped in a circuit breaker that opens after 5 consecutive failures for 30 seconds to protect downstream providers and preserve service threads.</w:t>
       </w:r>
     </w:p>
     <w:p>
@@ -1823,10 +908,10 @@
         <w:rPr>
           <w:b/>
         </w:rPr>
-        <w:t>Failure-handling paths</w:t>
+        <w:t>Failure handling paths:</w:t>
       </w:r>
       <w:r>
-        <w:t>: A gateway timeout triggers a status query before any retry to avoid double charging; an unconfirmable payment releases seats and leaves the booking unconfirmed per Story 3006; notification failure never rolls back a confirmed booking but raises a Severity 2 alert, because a passenger holding a valid ticket must not lose it due to a messaging outage.</w:t>
+        <w:t xml:space="preserve"> Service Bus subscriptions dead-letter after 10 delivery attempts; dead-letter depth greater than 0 raises an alert to the on-call engineer; poison messages are inspected and replayed through an operator runbook rather than discarded, so no passenger notification is silently lost.</w:t>
       </w:r>
     </w:p>
     <w:p>
@@ -1845,10 +930,10 @@
         <w:rPr>
           <w:b/>
         </w:rPr>
-        <w:t>Pipelines</w:t>
+        <w:t>Pipelines:</w:t>
       </w:r>
       <w:r>
-        <w:t>: GitHub Actions runs build, unit test, code scan, package, and deploy, producing one immutable artifact promoted unchanged through dev, test, and production; the pipeline fails closed on any high-severity CodeQL or dependency finding.</w:t>
+        <w:t xml:space="preserve"> GitHub Actions builds the .NET 8 solution and the React client, runs tests and security scans, publishes container images to Azure Container Registry tagged with the commit SHA, and deploys through Bicep - every artifact is traceable to a single commit.</w:t>
       </w:r>
     </w:p>
     <w:p>
@@ -1859,40 +944,10 @@
         <w:rPr>
           <w:b/>
         </w:rPr>
-        <w:t>Branching strategy</w:t>
+        <w:t>Branching strategy:</w:t>
       </w:r>
       <w:r>
-        <w:t xml:space="preserve">: Trunk-based development on </w:t>
-      </w:r>
-      <w:r>
-        <w:rPr>
-          <w:rFonts w:ascii="Consolas" w:hAnsi="Consolas"/>
-          <w:sz w:val="18"/>
-        </w:rPr>
-        <w:t>main</w:t>
-      </w:r>
-      <w:r>
-        <w:t xml:space="preserve"> with short-lived </w:t>
-      </w:r>
-      <w:r>
-        <w:rPr>
-          <w:rFonts w:ascii="Consolas" w:hAnsi="Consolas"/>
-          <w:sz w:val="18"/>
-        </w:rPr>
-        <w:t>feature/story-&lt;id&gt;</w:t>
-      </w:r>
-      <w:r>
-        <w:t xml:space="preserve"> branches named after the Azure DevOps story (for example </w:t>
-      </w:r>
-      <w:r>
-        <w:rPr>
-          <w:rFonts w:ascii="Consolas" w:hAnsi="Consolas"/>
-          <w:sz w:val="18"/>
-        </w:rPr>
-        <w:t>feature/story-3003-book-railway-tickets</w:t>
-      </w:r>
-      <w:r>
-        <w:t>), squash-merged through a pull request requiring one reviewer and green checks.</w:t>
+        <w:t xml:space="preserve"> Trunk-based development on main with short-lived feature branches named feature/&lt;work-item-id&gt;-&lt;slug&gt;; pull requests require one approving review, a green pipeline and linked Azure DevOps work item before merge, giving backlog-to-code traceability for Epic 2998.</w:t>
       </w:r>
     </w:p>
     <w:p>
@@ -1903,20 +958,10 @@
         <w:rPr>
           <w:b/>
         </w:rPr>
-        <w:t>Environment promotion rules</w:t>
+        <w:t>Environment promotion:</w:t>
       </w:r>
       <w:r>
-        <w:t xml:space="preserve">: dev deploys automatically on merge to </w:t>
-      </w:r>
-      <w:r>
-        <w:rPr>
-          <w:rFonts w:ascii="Consolas" w:hAnsi="Consolas"/>
-          <w:sz w:val="18"/>
-        </w:rPr>
-        <w:t>main</w:t>
-      </w:r>
-      <w:r>
-        <w:t>; test deploys on a tagged release candidate and requires the full regression suite to pass; production requires an approval gate from the release manager and a successful staging slot smoke test before swap.</w:t>
+        <w:t xml:space="preserve"> DEV deploys automatically on merge to main, QA requires QA Lead approval, and PROD requires Release Manager approval with a change record; identical Bicep templates are used in all three environments with only parameter files differing, eliminating configuration drift between environments.</w:t>
       </w:r>
     </w:p>
     <w:p>
@@ -1927,30 +972,10 @@
         <w:rPr>
           <w:b/>
         </w:rPr>
-        <w:t>Artifact versioning</w:t>
+        <w:t>Artifact versioning:</w:t>
       </w:r>
       <w:r>
-        <w:t xml:space="preserve">: Semantic versioning </w:t>
-      </w:r>
-      <w:r>
-        <w:rPr>
-          <w:rFonts w:ascii="Consolas" w:hAnsi="Consolas"/>
-          <w:sz w:val="18"/>
-        </w:rPr>
-        <w:t>MAJOR.MINOR.PATCH</w:t>
-      </w:r>
-      <w:r>
-        <w:t xml:space="preserve"> with the build number and Git commit SHA embedded in the artifact and exposed at </w:t>
-      </w:r>
-      <w:r>
-        <w:rPr>
-          <w:rFonts w:ascii="Consolas" w:hAnsi="Consolas"/>
-          <w:sz w:val="18"/>
-        </w:rPr>
-        <w:t>GET /api/health/version</w:t>
-      </w:r>
-      <w:r>
-        <w:t>, so any production incident can be traced to an exact commit in minutes.</w:t>
+        <w:t xml:space="preserve"> Semantic versioning (MAJOR.MINOR.PATCH) is applied to every service image and to the OpenAPI contract; images are immutable and never retagged, so a rollback is a redeploy of a known-good digest rather than a rebuild.</w:t>
       </w:r>
     </w:p>
     <w:p>
@@ -1961,835 +986,10 @@
         <w:rPr>
           <w:b/>
         </w:rPr>
-        <w:t>Rollback procedures</w:t>
+        <w:t>Rollback procedure:</w:t>
       </w:r>
       <w:r>
-        <w:t>: Production rollback is an Azure App Service slot swap back to the previous slot, targeted at under 10 minutes; database migrations must be backward compatible for one release (expand-then-contract) so code can roll back without a schema restore.</w:t>
-      </w:r>
-    </w:p>
-    <w:p>
-      <w:pPr>
-        <w:pStyle w:val="Heading2"/>
-      </w:pPr>
-      <w:r>
-        <w:t>4.7 Testing Strategy &amp; Quality Gates</w:t>
-      </w:r>
-    </w:p>
-    <w:p>
-      <w:pPr>
-        <w:pStyle w:val="ListBullet"/>
-      </w:pPr>
-      <w:r>
-        <w:rPr>
-          <w:b/>
-        </w:rPr>
-        <w:t>Testing stages</w:t>
-      </w:r>
-      <w:r>
-        <w:t>: Unit tests on domain services, integration tests against a containerized SQL Server and stubbed gateway, API contract tests, end-to-end UI tests with Playwright covering search, book, pay and cancel, and user acceptance testing mapped one-to-one to the eight story acceptance criteria.</w:t>
-      </w:r>
-    </w:p>
-    <w:p>
-      <w:pPr>
-        <w:pStyle w:val="ListBullet"/>
-      </w:pPr>
-      <w:r>
-        <w:rPr>
-          <w:b/>
-        </w:rPr>
-        <w:t>Automation coverage thresholds</w:t>
-      </w:r>
-      <w:r>
-        <w:t xml:space="preserve">: Minimum 80% line coverage overall and 90% on </w:t>
-      </w:r>
-      <w:r>
-        <w:rPr>
-          <w:rFonts w:ascii="Consolas" w:hAnsi="Consolas"/>
-          <w:sz w:val="18"/>
-        </w:rPr>
-        <w:t>BookingService</w:t>
-      </w:r>
-      <w:r>
-        <w:t xml:space="preserve">, </w:t>
-      </w:r>
-      <w:r>
-        <w:rPr>
-          <w:rFonts w:ascii="Consolas" w:hAnsi="Consolas"/>
-          <w:sz w:val="18"/>
-        </w:rPr>
-        <w:t>PaymentService</w:t>
-      </w:r>
-      <w:r>
-        <w:t xml:space="preserve">, and </w:t>
-      </w:r>
-      <w:r>
-        <w:rPr>
-          <w:rFonts w:ascii="Consolas" w:hAnsi="Consolas"/>
-          <w:sz w:val="18"/>
-        </w:rPr>
-        <w:t>RefundService</w:t>
-      </w:r>
-      <w:r>
-        <w:t>, because those classes hold the seat-inventory and money-movement rules where a defect is most expensive.</w:t>
-      </w:r>
-    </w:p>
-    <w:p>
-      <w:pPr>
-        <w:pStyle w:val="ListBullet"/>
-      </w:pPr>
-      <w:r>
-        <w:rPr>
-          <w:b/>
-        </w:rPr>
-        <w:t>Environment readiness gates</w:t>
-      </w:r>
-      <w:r>
-        <w:t xml:space="preserve">: A build may not promote unless database migrations applied cleanly, the gateway sandbox is reachable, seeded train/station master data exists, and the health endpoint returns </w:t>
-      </w:r>
-      <w:r>
-        <w:rPr>
-          <w:rFonts w:ascii="Consolas" w:hAnsi="Consolas"/>
-          <w:sz w:val="18"/>
-        </w:rPr>
-        <w:t>Healthy</w:t>
-      </w:r>
-      <w:r>
-        <w:t xml:space="preserve"> for database, Key Vault, and both external dependencies.</w:t>
-      </w:r>
-    </w:p>
-    <w:p>
-      <w:pPr>
-        <w:pStyle w:val="ListBullet"/>
-      </w:pPr>
-      <w:r>
-        <w:rPr>
-          <w:b/>
-        </w:rPr>
-        <w:t>Defect severity rules</w:t>
-      </w:r>
-      <w:r>
-        <w:t>: Severity 1 (overbooking, double charge, confirmed ticket without payment) blocks release unconditionally; Severity 2 (refund miscalculation, missing notification) blocks release unless an approved workaround exists; Severity 3 and 4 are scheduled into the next sprint.</w:t>
-      </w:r>
-    </w:p>
-    <w:p>
-      <w:pPr>
-        <w:pStyle w:val="ListBullet"/>
-      </w:pPr>
-      <w:r>
-        <w:rPr>
-          <w:b/>
-        </w:rPr>
-        <w:t>Performance benchmarks</w:t>
-      </w:r>
-      <w:r>
-        <w:t>: A load test must sustain 200 concurrent search users and 50 concurrent bookings per minute while holding the p95 latency targets in Section 4.3, with zero overbooking observed across a 30-minute soak test.</w:t>
-      </w:r>
-    </w:p>
-    <w:p>
-      <w:pPr>
-        <w:pStyle w:val="Heading1"/>
-      </w:pPr>
-      <w:r>
-        <w:t>5. Implementation Plan</w:t>
-      </w:r>
-    </w:p>
-    <w:p>
-      <w:pPr>
-        <w:pStyle w:val="Heading2"/>
-      </w:pPr>
-      <w:r>
-        <w:t>5.1 Phased Rollout Strategy</w:t>
-      </w:r>
-    </w:p>
-    <w:p>
-      <w:pPr>
-        <w:pStyle w:val="ListBullet"/>
-      </w:pPr>
-      <w:r>
-        <w:rPr>
-          <w:b/>
-        </w:rPr>
-        <w:t>Week 1-2 - Foundation</w:t>
-      </w:r>
-      <w:r>
-        <w:t>: Provision dev and test Azure resources from Bicep (</w:t>
-      </w:r>
-      <w:r>
-        <w:rPr>
-          <w:rFonts w:ascii="Consolas" w:hAnsi="Consolas"/>
-          <w:sz w:val="18"/>
-        </w:rPr>
-        <w:t>app-railway-api-*</w:t>
-      </w:r>
-      <w:r>
-        <w:t xml:space="preserve">, </w:t>
-      </w:r>
-      <w:r>
-        <w:rPr>
-          <w:rFonts w:ascii="Consolas" w:hAnsi="Consolas"/>
-          <w:sz w:val="18"/>
-        </w:rPr>
-        <w:t>swa-railway-ui-*</w:t>
-      </w:r>
-      <w:r>
-        <w:t xml:space="preserve">, </w:t>
-      </w:r>
-      <w:r>
-        <w:rPr>
-          <w:rFonts w:ascii="Consolas" w:hAnsi="Consolas"/>
-          <w:sz w:val="18"/>
-        </w:rPr>
-        <w:t>sql-railway-*</w:t>
-      </w:r>
-      <w:r>
-        <w:t xml:space="preserve">, </w:t>
-      </w:r>
-      <w:r>
-        <w:rPr>
-          <w:rFonts w:ascii="Consolas" w:hAnsi="Consolas"/>
-          <w:sz w:val="18"/>
-        </w:rPr>
-        <w:t>kv-railway-*</w:t>
-      </w:r>
-      <w:r>
-        <w:t xml:space="preserve">, </w:t>
-      </w:r>
-      <w:r>
-        <w:rPr>
-          <w:rFonts w:ascii="Consolas" w:hAnsi="Consolas"/>
-          <w:sz w:val="18"/>
-        </w:rPr>
-        <w:t>appi-railway-*</w:t>
-      </w:r>
-      <w:r>
-        <w:t xml:space="preserve">), stand up the GitHub Actions pipeline, scaffold the .NET 8 solution and React TypeScript app, and apply the initial EF Core migration for all thirteen entities. Advancement criterion: pipeline deploys an empty-but-healthy API to dev and </w:t>
-      </w:r>
-      <w:r>
-        <w:rPr>
-          <w:rFonts w:ascii="Consolas" w:hAnsi="Consolas"/>
-          <w:sz w:val="18"/>
-        </w:rPr>
-        <w:t>GET /api/health</w:t>
-      </w:r>
-      <w:r>
-        <w:t xml:space="preserve"> returns </w:t>
-      </w:r>
-      <w:r>
-        <w:rPr>
-          <w:rFonts w:ascii="Consolas" w:hAnsi="Consolas"/>
-          <w:sz w:val="18"/>
-        </w:rPr>
-        <w:t>Healthy</w:t>
-      </w:r>
-      <w:r>
-        <w:t>.</w:t>
-      </w:r>
-    </w:p>
-    <w:p>
-      <w:pPr>
-        <w:pStyle w:val="ListBullet"/>
-      </w:pPr>
-      <w:r>
-        <w:rPr>
-          <w:b/>
-        </w:rPr>
-        <w:t>Week 3-4 - Search and availability (Feature 2999)</w:t>
-      </w:r>
-      <w:r>
-        <w:t xml:space="preserve">: Implement </w:t>
-      </w:r>
-      <w:r>
-        <w:rPr>
-          <w:rFonts w:ascii="Consolas" w:hAnsi="Consolas"/>
-          <w:sz w:val="18"/>
-        </w:rPr>
-        <w:t>TrainSearchService</w:t>
-      </w:r>
-      <w:r>
-        <w:t xml:space="preserve">, </w:t>
-      </w:r>
-      <w:r>
-        <w:rPr>
-          <w:rFonts w:ascii="Consolas" w:hAnsi="Consolas"/>
-          <w:sz w:val="18"/>
-        </w:rPr>
-        <w:t>SeatAvailabilityService</w:t>
-      </w:r>
-      <w:r>
-        <w:t>, their repositories, and the Train Search UI. Advancement criterion: Stories 3000 and 3001 acceptance criteria pass in test with seeded master data and p95 search latency of 800 ms or less.</w:t>
-      </w:r>
-    </w:p>
-    <w:p>
-      <w:pPr>
-        <w:pStyle w:val="ListBullet"/>
-      </w:pPr>
-      <w:r>
-        <w:rPr>
-          <w:b/>
-        </w:rPr>
-        <w:t>Week 5-6 - Booking and profiles (Feature 3002)</w:t>
-      </w:r>
-      <w:r>
-        <w:t xml:space="preserve">: Implement </w:t>
-      </w:r>
-      <w:r>
-        <w:rPr>
-          <w:rFonts w:ascii="Consolas" w:hAnsi="Consolas"/>
-          <w:sz w:val="18"/>
-        </w:rPr>
-        <w:t>BookingService</w:t>
-      </w:r>
-      <w:r>
-        <w:t xml:space="preserve"> with transactional seat decrement, booking-reference generation, </w:t>
-      </w:r>
-      <w:r>
-        <w:rPr>
-          <w:rFonts w:ascii="Consolas" w:hAnsi="Consolas"/>
-          <w:sz w:val="18"/>
-        </w:rPr>
-        <w:t>PassengerService</w:t>
-      </w:r>
-      <w:r>
-        <w:t>, and the Booking and Profile UIs. Advancement criterion: Stories 3003 and 3004 pass, and a concurrency test proves zero overbooking at 50 simultaneous bookings on one seat pool.</w:t>
-      </w:r>
-    </w:p>
-    <w:p>
-      <w:pPr>
-        <w:pStyle w:val="ListBullet"/>
-      </w:pPr>
-      <w:r>
-        <w:rPr>
-          <w:b/>
-        </w:rPr>
-        <w:t>Week 7-8 - Payments (Story 3006)</w:t>
-      </w:r>
-      <w:r>
-        <w:t>: Integrate the Payment Gateway sandbox, implement idempotency keys, confirm/release logic, and the Payment UI. Advancement criterion: no confirmed ticket exists for any failed payment across the full negative-path test matrix.</w:t>
-      </w:r>
-    </w:p>
-    <w:p>
-      <w:pPr>
-        <w:pStyle w:val="ListBullet"/>
-      </w:pPr>
-      <w:r>
-        <w:rPr>
-          <w:b/>
-        </w:rPr>
-        <w:t>Week 9 - Cancellation and refunds (Story 3007)</w:t>
-      </w:r>
-      <w:r>
-        <w:t xml:space="preserve">: Implement </w:t>
-      </w:r>
-      <w:r>
-        <w:rPr>
-          <w:rFonts w:ascii="Consolas" w:hAnsi="Consolas"/>
-          <w:sz w:val="18"/>
-        </w:rPr>
-        <w:t>RefundService</w:t>
-      </w:r>
-      <w:r>
-        <w:t xml:space="preserve"> with the configurable policy slabs, the cancellation endpoint, and refund status visibility. Advancement criterion: refund amounts match the business-supplied slab table for all boundary cases.</w:t>
-      </w:r>
-    </w:p>
-    <w:p>
-      <w:pPr>
-        <w:pStyle w:val="ListBullet"/>
-      </w:pPr>
-      <w:r>
-        <w:rPr>
-          <w:b/>
-        </w:rPr>
-        <w:t>Week 10 - Notifications (Story 3009)</w:t>
-      </w:r>
-      <w:r>
-        <w:t>: Implement the outbox dispatcher, three provider templates, and delivery-status persistence for booking, cancellation, and schedule-change events. Advancement criterion: at least 99% delivery on a 500-message smoke batch.</w:t>
-      </w:r>
-    </w:p>
-    <w:p>
-      <w:pPr>
-        <w:pStyle w:val="ListBullet"/>
-      </w:pPr>
-      <w:r>
-        <w:rPr>
-          <w:b/>
-        </w:rPr>
-        <w:t>Week 11 - Support (Story 3010)</w:t>
-      </w:r>
-      <w:r>
-        <w:t xml:space="preserve">: Implement </w:t>
-      </w:r>
-      <w:r>
-        <w:rPr>
-          <w:rFonts w:ascii="Consolas" w:hAnsi="Consolas"/>
-          <w:sz w:val="18"/>
-        </w:rPr>
-        <w:t>SupportService</w:t>
-      </w:r>
-      <w:r>
-        <w:t xml:space="preserve"> with create, track, update, and close transitions plus the Support Agent role view. Advancement criterion: a support request can be followed through its full lifecycle to closure with an audit trail.</w:t>
-      </w:r>
-    </w:p>
-    <w:p>
-      <w:pPr>
-        <w:pStyle w:val="ListBullet"/>
-      </w:pPr>
-      <w:r>
-        <w:rPr>
-          <w:b/>
-        </w:rPr>
-        <w:t>Week 12 - Hardening</w:t>
-      </w:r>
-      <w:r>
-        <w:t>: Run penetration testing, the load and soak tests from Section 4.7, WAF tuning, and Key Vault/Managed Identity verification in a production-like environment. Advancement criterion: zero open Severity 1 or Severity 2 defects.</w:t>
-      </w:r>
-    </w:p>
-    <w:p>
-      <w:pPr>
-        <w:pStyle w:val="ListBullet"/>
-      </w:pPr>
-      <w:r>
-        <w:rPr>
-          <w:b/>
-        </w:rPr>
-        <w:t>Week 13 - Production pilot</w:t>
-      </w:r>
-      <w:r>
-        <w:t>: Deploy to production behind a feature flag limited to a single route pair and an invited passenger cohort, monitoring conversion, payment success rate, and error budget daily. Advancement criterion: 7 consecutive days within SLA with no Severity 1 incident.</w:t>
-      </w:r>
-    </w:p>
-    <w:p>
-      <w:pPr>
-        <w:pStyle w:val="ListBullet"/>
-      </w:pPr>
-      <w:r>
-        <w:rPr>
-          <w:b/>
-        </w:rPr>
-        <w:t>Week 14 - General availability</w:t>
-      </w:r>
-      <w:r>
-        <w:t>: Remove the feature flag, enable all routes, publish runbooks, and transition to the standing support rota. Advancement criterion: operations sign-off with runbooks, dashboards, and alerts in place.</w:t>
-      </w:r>
-    </w:p>
-    <w:p>
-      <w:pPr>
-        <w:pStyle w:val="Heading2"/>
-      </w:pPr>
-      <w:r>
-        <w:t>5.2 Teams and Security Roles</w:t>
-      </w:r>
-    </w:p>
-    <w:p>
-      <w:pPr>
-        <w:pStyle w:val="ListBullet"/>
-      </w:pPr>
-      <w:r>
-        <w:rPr>
-          <w:b/>
-        </w:rPr>
-        <w:t>Product Owner (Azure DevOps)</w:t>
-      </w:r>
-      <w:r>
-        <w:t>: Owns Epic 2998 scope, prioritizes the four Features, approves acceptance-criteria interpretation, and signs off user acceptance testing. Escalation path for scope disputes and refund-policy clarification.</w:t>
-      </w:r>
-    </w:p>
-    <w:p>
-      <w:pPr>
-        <w:pStyle w:val="ListBullet"/>
-      </w:pPr>
-      <w:r>
-        <w:rPr>
-          <w:b/>
-        </w:rPr>
-        <w:t>Architect</w:t>
-      </w:r>
-      <w:r>
-        <w:t>: Owns this System Design Document, the six diagrams, and all Architecture Decision Records; approves any deviation from the layered React/.NET 8/Azure SQL baseline and reviews schema changes before migration merge.</w:t>
-      </w:r>
-    </w:p>
-    <w:p>
-      <w:pPr>
-        <w:pStyle w:val="ListBullet"/>
-      </w:pPr>
-      <w:r>
-        <w:rPr>
-          <w:b/>
-        </w:rPr>
-        <w:t>Frontend team (React/TypeScript)</w:t>
-      </w:r>
-      <w:r>
-        <w:t xml:space="preserve">: Owns the Static Web App, the five UI modules, token handling in the browser, and accessibility; has Contributor RBAC on </w:t>
-      </w:r>
-      <w:r>
-        <w:rPr>
-          <w:rFonts w:ascii="Consolas" w:hAnsi="Consolas"/>
-          <w:sz w:val="18"/>
-        </w:rPr>
-        <w:t>swa-railway-ui-dev</w:t>
-      </w:r>
-      <w:r>
-        <w:t xml:space="preserve"> and </w:t>
-      </w:r>
-      <w:r>
-        <w:rPr>
-          <w:rFonts w:ascii="Consolas" w:hAnsi="Consolas"/>
-          <w:sz w:val="18"/>
-        </w:rPr>
-        <w:t>-test</w:t>
-      </w:r>
-      <w:r>
-        <w:t xml:space="preserve"> only, never on production.</w:t>
-      </w:r>
-    </w:p>
-    <w:p>
-      <w:pPr>
-        <w:pStyle w:val="ListBullet"/>
-      </w:pPr>
-      <w:r>
-        <w:rPr>
-          <w:b/>
-        </w:rPr>
-        <w:t>Backend team (.NET 8)</w:t>
-      </w:r>
-      <w:r>
-        <w:t>: Owns the six API groups, domain services, repositories, EF Core migrations, and external integrations; has Contributor RBAC on dev and test App Services and read-only access to production telemetry.</w:t>
-      </w:r>
-    </w:p>
-    <w:p>
-      <w:pPr>
-        <w:pStyle w:val="ListBullet"/>
-      </w:pPr>
-      <w:r>
-        <w:rPr>
-          <w:b/>
-        </w:rPr>
-        <w:t>Database/Data owner</w:t>
-      </w:r>
-      <w:r>
-        <w:t xml:space="preserve">: Owns </w:t>
-      </w:r>
-      <w:r>
-        <w:rPr>
-          <w:rFonts w:ascii="Consolas" w:hAnsi="Consolas"/>
-          <w:sz w:val="18"/>
-        </w:rPr>
-        <w:t>RailwayTicketingDb</w:t>
-      </w:r>
-      <w:r>
-        <w:t xml:space="preserve"> schema, indexing, retention, and PII column encryption; the sole role permitted to approve production migration scripts and to grant any direct database access.</w:t>
-      </w:r>
-    </w:p>
-    <w:p>
-      <w:pPr>
-        <w:pStyle w:val="ListBullet"/>
-      </w:pPr>
-      <w:r>
-        <w:rPr>
-          <w:b/>
-        </w:rPr>
-        <w:t>Security engineer</w:t>
-      </w:r>
-      <w:r>
-        <w:t>: Owns Key Vault access policies, WAF rules, key-rotation schedules, and the PCI DSS SAQ-A posture; approves every new secret and every new outbound integration endpoint.</w:t>
-      </w:r>
-    </w:p>
-    <w:p>
-      <w:pPr>
-        <w:pStyle w:val="ListBullet"/>
-      </w:pPr>
-      <w:r>
-        <w:rPr>
-          <w:b/>
-        </w:rPr>
-        <w:t>DevOps/Platform engineer</w:t>
-      </w:r>
-      <w:r>
-        <w:t>: Owns Bicep infrastructure, GitHub Actions pipelines, environment promotion gates, and slot-swap rollback execution; the only role with production deployment rights, exercised through the approval gate.</w:t>
-      </w:r>
-    </w:p>
-    <w:p>
-      <w:pPr>
-        <w:pStyle w:val="ListBullet"/>
-      </w:pPr>
-      <w:r>
-        <w:rPr>
-          <w:b/>
-        </w:rPr>
-        <w:t>QA lead</w:t>
-      </w:r>
-      <w:r>
-        <w:t>: Owns the test strategy, coverage thresholds, defect severity triage, and the performance benchmark suite; holds the authority to block a release on a Severity 1 defect.</w:t>
-      </w:r>
-    </w:p>
-    <w:p>
-      <w:pPr>
-        <w:pStyle w:val="ListBullet"/>
-      </w:pPr>
-      <w:r>
-        <w:rPr>
-          <w:b/>
-        </w:rPr>
-        <w:t>Support Agent (application role)</w:t>
-      </w:r>
-      <w:r>
-        <w:t>: Operational role defined inside the product for Story 3010, granted read-only access to bookings referenced by an open support request and write access to support-request status and notes; cannot issue refunds without an approved cancellation.</w:t>
-      </w:r>
-    </w:p>
-    <w:p>
-      <w:pPr>
-        <w:pStyle w:val="ListBullet"/>
-      </w:pPr>
-      <w:r>
-        <w:rPr>
-          <w:b/>
-        </w:rPr>
-        <w:t>Site reliability on-call</w:t>
-      </w:r>
-      <w:r>
-        <w:t>: Owns incident response against the Section 4.3 escalation SLAs, runbook execution, and the quarterly restore drill; escalates unresolved Severity 1 incidents to the Architect and Product Owner after 2 hours.</w:t>
-      </w:r>
-    </w:p>
-    <w:p>
-      <w:pPr>
-        <w:pStyle w:val="Heading1"/>
-      </w:pPr>
-      <w:r>
-        <w:t>6. Effort &amp; Schedule Estimation</w:t>
-      </w:r>
-    </w:p>
-    <w:p>
-      <w:pPr>
-        <w:pStyle w:val="Heading2"/>
-      </w:pPr>
-      <w:r>
-        <w:t>6.1 Estimation Approach</w:t>
-      </w:r>
-    </w:p>
-    <w:p>
-      <w:r>
-        <w:t>Estimation uses three complementary techniques so that a single method's bias does not drive the plan. Story points are assigned on a modified Fibonacci scale (1, 2, 3, 5, 8, 13) during refinement: Stories 3000 and 3001 are 5 points each, 3003 is 13 points because of the concurrency-safe seat reservation, 3004 is 5 points, 3006 is 13 points due to gateway integration and idempotency, 3007 is 8 points for the policy slab engine, 3009 is 8 points for the outbox and three templates, and 3010 is 5 points - a total of 62 points for Epic 2998. T-shirt sizing is applied at Feature level for executive communication: Train Search and Availability is M, Booking and Passenger Management is L, Payments and Ticket Lifecycle is XL, and Notifications and Support is M. Three-point estimation is then applied to the whole Epic to express schedule risk: Optimistic 11 weeks (gateway sandbox available on day one, master data clean), Realistic 14 weeks (the plan in Section 5.1), and Pessimistic 18 weeks (gateway certification delays, refund-policy rework, or master-data quality remediation), giving a PERT expected duration of approximately 14.2 weeks. The dominant estimation risk is external: payment-gateway certification and notification-provider sender verification are vendor-controlled and are therefore tracked as dependencies rather than as team velocity.</w:t>
-      </w:r>
-    </w:p>
-    <w:p>
-      <w:pPr>
-        <w:pStyle w:val="Heading2"/>
-      </w:pPr>
-      <w:r>
-        <w:t>6.2 Timeline &amp; Milestones</w:t>
-      </w:r>
-    </w:p>
-    <w:p>
-      <w:pPr>
-        <w:pStyle w:val="ListBullet"/>
-      </w:pPr>
-      <w:r>
-        <w:rPr>
-          <w:b/>
-        </w:rPr>
-        <w:t>M1 - Foundation ready (Week 1 start to Week 2 end)</w:t>
-      </w:r>
-      <w:r>
-        <w:t>: Azure dev/test environments, CI/CD pipeline, and initial schema. Dependency: Azure subscription and Bicep approval. Critical path: yes - every later milestone waits on the pipeline and schema.</w:t>
-      </w:r>
-    </w:p>
-    <w:p>
-      <w:pPr>
-        <w:pStyle w:val="ListBullet"/>
-      </w:pPr>
-      <w:r>
-        <w:rPr>
-          <w:b/>
-        </w:rPr>
-        <w:t>M2 - Search and availability complete (Week 3 start to Week 4 end)</w:t>
-      </w:r>
-      <w:r>
-        <w:t>: Stories 3000 and 3001 accepted. Dependency: seeded train, station, schedule, class, and fare master data. Critical path: yes - booking cannot be built without schedule and inventory reads.</w:t>
-      </w:r>
-    </w:p>
-    <w:p>
-      <w:pPr>
-        <w:pStyle w:val="ListBullet"/>
-      </w:pPr>
-      <w:r>
-        <w:rPr>
-          <w:b/>
-        </w:rPr>
-        <w:t>M3 - Booking and profiles complete (Week 5 start to Week 6 end)</w:t>
-      </w:r>
-      <w:r>
-        <w:t>: Stories 3003 and 3004 accepted with the zero-overbooking concurrency test passing. Dependency: M2. Critical path: yes.</w:t>
-      </w:r>
-    </w:p>
-    <w:p>
-      <w:pPr>
-        <w:pStyle w:val="ListBullet"/>
-      </w:pPr>
-      <w:r>
-        <w:rPr>
-          <w:b/>
-        </w:rPr>
-        <w:t>M4 - Payments and refunds complete (Week 7 start to Week 9 end)</w:t>
-      </w:r>
-      <w:r>
-        <w:t>: Stories 3006 and 3007 accepted. Dependency: payment-gateway sandbox credentials and the business-approved refund slab table, both required no later than Week 6. Critical path: yes, and this is the highest-risk segment of the schedule.</w:t>
-      </w:r>
-    </w:p>
-    <w:p>
-      <w:pPr>
-        <w:pStyle w:val="ListBullet"/>
-      </w:pPr>
-      <w:r>
-        <w:rPr>
-          <w:b/>
-        </w:rPr>
-        <w:t>M5 - Notifications, support, hardening and go-live (Week 10 start to Week 14 end)</w:t>
-      </w:r>
-      <w:r>
-        <w:t>: Stories 3009 and 3010 accepted, security and load testing passed, pilot completed, general availability declared. Dependency: notification-provider sender verification by Week 9. Critical path: partially - Story 3010 can run parallel to hardening, so only notifications and hardening sit on the critical path.</w:t>
-      </w:r>
-    </w:p>
-    <w:p>
-      <w:pPr>
-        <w:pStyle w:val="Heading1"/>
-      </w:pPr>
-      <w:r>
-        <w:t>7. Assumptions &amp; Dependencies</w:t>
-      </w:r>
-    </w:p>
-    <w:p>
-      <w:pPr>
-        <w:pStyle w:val="Heading2"/>
-      </w:pPr>
-      <w:r>
-        <w:t>7.1 Assumptions</w:t>
-      </w:r>
-    </w:p>
-    <w:p>
-      <w:r>
-        <w:t>Train, station, schedule, travel-class, and fare master data is supplied and maintained by an upstream railway master-data system, because no User Story under Epic 2998 defines administrative maintenance of this data; the platform reads it and does not author it. Passenger identity is handled by this platform's own JWT-based sign-in with Passenger and Support Agent roles, since no story specifies an external identity provider, and the design keeps this swappable for Microsoft Entra ID later. Payment card data is captured on a hosted gateway page, so the system stores only a gateway reference, amount, method, and status - this is the assumption that keeps PCI DSS scope at SAQ-A. The refund policy is a configurable set of hours-to-departure slabs provided by the business rather than a fixed formula, because Story 3007 states only that refunds are calculated per policy. Single-currency, single-region operation is assumed for the first release, as no story mentions multi-currency or data residency beyond one Azure region. Email and SMS are the only notification channels, per Story 3009, with push notifications deliberately deferred. Seat selection is at travel-class granularity rather than specific seat-map picking, since Story 3001 asks for availability by class. All assumptions are recorded here so they can be challenged during design review rather than discovered during implementation.</w:t>
-      </w:r>
-    </w:p>
-    <w:p>
-      <w:pPr>
-        <w:pStyle w:val="Heading2"/>
-      </w:pPr>
-      <w:r>
-        <w:t>7.2 External Dependencies</w:t>
-      </w:r>
-    </w:p>
-    <w:p>
-      <w:r>
-        <w:t>The Payment Gateway is the most significant external dependency: the program needs sandbox credentials by Week 6 and production merchant certification before the Week 13 pilot, with an expected gateway availability of 99.9% and refund settlement within the provider's stated banking cycle; a gateway outage degrades booking confirmation and is the primary Severity 1 risk. The Email/SMS Provider must complete sender identity and SMS short-code verification by Week 9 and is expected to deliver at least 99% of messages, with queued retries covering transient failures. Azure platform services carry Microsoft's standard service level agreements - Azure SQL Database 99.99%, App Service 99.95%, Key Vault 99.99% - and their availability bounds the 99.9% application target stated in Section 4.3. The upstream railway master-data source must deliver an initial load before Week 3 and incremental updates daily, as schedule and fare accuracy directly determines search correctness. Internally, the Security team must approve WAF rules and Key Vault access policies before the Week 12 hardening phase, the Database owner must approve production migrations, and the Platform team must provide the production subscription and approval gates by Week 12. Each dependency has a named owner and a required-by week so that slippage is visible on the critical path described in Section 6.2.</w:t>
-      </w:r>
-    </w:p>
-    <w:p>
-      <w:pPr>
-        <w:pStyle w:val="Heading1"/>
-      </w:pPr>
-      <w:r>
-        <w:t>8. Appendices</w:t>
-      </w:r>
-    </w:p>
-    <w:p>
-      <w:pPr>
-        <w:pStyle w:val="Heading2"/>
-      </w:pPr>
-      <w:r>
-        <w:t>8.1 Additional Diagrams</w:t>
-      </w:r>
-    </w:p>
-    <w:p>
-      <w:r>
-        <w:rPr>
-          <w:rFonts w:ascii="Consolas" w:hAnsi="Consolas"/>
-          <w:sz w:val="18"/>
-        </w:rPr>
-        <w:t>- !High-Level Flow</w:t>
-      </w:r>
-    </w:p>
-    <w:p>
-      <w:r>
-        <w:t>![High-Level Flow](system-context.png)</w:t>
-      </w:r>
-    </w:p>
-    <w:p>
-      <w:r>
-        <w:t>*Caption - High-Level Flow:* The system context view, tying Epic 2998's two human actors (Passenger, Support Agent) and two external systems (Payment Gateway, Email/SMS Provider) to the single platform boundary that owns all booking data.</w:t>
-      </w:r>
-    </w:p>
-    <w:p>
-      <w:pPr>
-        <w:jc w:val="center"/>
-      </w:pPr>
-      <w:r>
-        <w:drawing>
-          <wp:inline xmlns:a="http://schemas.openxmlformats.org/drawingml/2006/main" xmlns:pic="http://schemas.openxmlformats.org/drawingml/2006/picture">
-            <wp:extent cx="5760720" cy="484721"/>
-            <wp:docPr id="3" name="Picture 3"/>
-            <wp:cNvGraphicFramePr>
-              <a:graphicFrameLocks noChangeAspect="1"/>
-            </wp:cNvGraphicFramePr>
-            <a:graphic>
-              <a:graphicData uri="http://schemas.openxmlformats.org/drawingml/2006/picture">
-                <pic:pic>
-                  <pic:nvPicPr>
-                    <pic:cNvPr id="0" name="image.png"/>
-                    <pic:cNvPicPr/>
-                  </pic:nvPicPr>
-                  <pic:blipFill>
-                    <a:blip r:embed="rId10"/>
-                    <a:stretch>
-                      <a:fillRect/>
-                    </a:stretch>
-                  </pic:blipFill>
-                  <pic:spPr>
-                    <a:xfrm>
-                      <a:off x="0" y="0"/>
-                      <a:ext cx="5760720" cy="484721"/>
-                    </a:xfrm>
-                    <a:prstGeom prst="rect"/>
-                  </pic:spPr>
-                </pic:pic>
-              </a:graphicData>
-            </a:graphic>
-          </wp:inline>
-        </w:drawing>
-      </w:r>
-    </w:p>
-    <w:p>
-      <w:pPr>
-        <w:jc w:val="center"/>
-      </w:pPr>
-      <w:r>
-        <w:rPr>
-          <w:b/>
-          <w:i/>
-          <w:sz w:val="18"/>
-        </w:rPr>
-        <w:t>Deployment Diagram</w:t>
-      </w:r>
-    </w:p>
-    <w:p>
-      <w:pPr>
-        <w:jc w:val="center"/>
-      </w:pPr>
-      <w:r>
-        <w:rPr>
-          <w:i/>
-          <w:color w:val="646464"/>
-          <w:sz w:val="16"/>
-        </w:rPr>
-        <w:t>Source artifact: docs/architecture/epic-2998/deployment.png</w:t>
-      </w:r>
-    </w:p>
-    <w:p>
-      <w:r>
-        <w:t>![Deployment Diagram](deployment.png)</w:t>
-      </w:r>
-    </w:p>
-    <w:p>
-      <w:r>
-        <w:t>*Caption - Deployment Diagram:* Shows the production topology - Azure Front Door with WAF, the React UI on Azure Static Web Apps, the .NET 8 API on Azure App Service, Azure SQL Database, Key Vault, Application Insights, and Log Analytics - and where the two external integrations exit the Azure boundary. It supports the SLA, RTO/RPO, and network-segmentation commitments in Sections 4.3 and 4.4.</w:t>
+        <w:t xml:space="preserve"> Production uses blue-green deployment slots with a documented swap-back that restores the previous version in under 5 minutes; database changes are forward-only and backward-compatible for one release so application rollback never requires a schema rollback.</w:t>
       </w:r>
     </w:p>
     <w:p>
@@ -2854,22 +1054,877 @@
           <w:color w:val="646464"/>
           <w:sz w:val="16"/>
         </w:rPr>
-        <w:t>Source artifact: docs/architecture/epic-2998/cicd.png</w:t>
+        <w:t>Source artifact: docs/architecture/epic-2998/cicd-pipeline.png</w:t>
       </w:r>
     </w:p>
     <w:p>
       <w:r>
-        <w:t xml:space="preserve">*Caption - CI/CD Pipeline:* One immutable artifact is promoted from dev through test to production. A developer opens a pull request from a </w:t>
+        <w:rPr>
+          <w:b/>
+        </w:rPr>
+        <w:t>Caption:</w:t>
       </w:r>
       <w:r>
+        <w:t xml:space="preserve"> The CI/CD diagram shows commit-to-production flow with the quality and approval gates that protect passenger-facing ticketing.</w:t>
+      </w:r>
+    </w:p>
+    <w:p>
+      <w:pPr>
+        <w:pStyle w:val="Heading2"/>
+      </w:pPr>
+      <w:r>
+        <w:t>4.7 Testing Strategy &amp; Quality Gates</w:t>
+      </w:r>
+    </w:p>
+    <w:p>
+      <w:pPr>
+        <w:pStyle w:val="ListBullet"/>
+      </w:pPr>
+      <w:r>
         <w:rPr>
-          <w:rFonts w:ascii="Consolas" w:hAnsi="Consolas"/>
+          <w:b/>
+        </w:rPr>
+        <w:t>Test stages:</w:t>
+      </w:r>
+      <w:r>
+        <w:t xml:space="preserve"> Unit tests (xUnit for .NET, Vitest for React) run on every push; integration tests exercise booking, payment-webhook and notification flows against ephemeral dependencies; end-to-end tests cover search, book, pay, cancel and support-request journeys mapped one-to-one to User Stories 3000, 3001, 3003, 3004, 3006, 3007, 3009 and 3010.</w:t>
+      </w:r>
+    </w:p>
+    <w:p>
+      <w:pPr>
+        <w:pStyle w:val="ListBullet"/>
+      </w:pPr>
+      <w:r>
+        <w:rPr>
+          <w:b/>
+        </w:rPr>
+        <w:t>Coverage thresholds:</w:t>
+      </w:r>
+      <w:r>
+        <w:t xml:space="preserve"> Minimum 80 percent line coverage overall and 90 percent for the Booking and Payment domain layers, enforced as a hard pipeline gate because these layers carry seat-inventory and monetary correctness.</w:t>
+      </w:r>
+    </w:p>
+    <w:p>
+      <w:pPr>
+        <w:pStyle w:val="ListBullet"/>
+      </w:pPr>
+      <w:r>
+        <w:rPr>
+          <w:b/>
+        </w:rPr>
+        <w:t>Environment readiness gates:</w:t>
+      </w:r>
+      <w:r>
+        <w:t xml:space="preserve"> A deployment is only promoted after smoke tests confirm health endpoints, database connectivity, cache connectivity and Service Bus subscription health; any failed readiness check blocks promotion automatically.</w:t>
+      </w:r>
+    </w:p>
+    <w:p>
+      <w:pPr>
+        <w:pStyle w:val="ListBullet"/>
+      </w:pPr>
+      <w:r>
+        <w:rPr>
+          <w:b/>
+        </w:rPr>
+        <w:t>Defect severity rules:</w:t>
+      </w:r>
+      <w:r>
+        <w:t xml:space="preserve"> Severity 1 (money captured without a ticket, double booking of a seat, payment data exposure) blocks release unconditionally; Severity 2 (notification not delivered, availability display stale beyond the 60-second cache window) blocks release unless an approved mitigation exists; Severity 3 and 4 are scheduled into the next sprint.</w:t>
+      </w:r>
+    </w:p>
+    <w:p>
+      <w:pPr>
+        <w:pStyle w:val="ListBullet"/>
+      </w:pPr>
+      <w:r>
+        <w:rPr>
+          <w:b/>
+        </w:rPr>
+        <w:t>Performance benchmarks:</w:t>
+      </w:r>
+      <w:r>
+        <w:t xml:space="preserve"> Load tests sustain 500 concurrent search users and 100 concurrent bookings per minute while holding the 95th-percentile targets in Section 4.3, with a negative test proving that a declined payment never results in a confirmed ticket and that the held seat is returned to inventory.</w:t>
+      </w:r>
+    </w:p>
+    <w:p/>
+    <w:p>
+      <w:pPr>
+        <w:pStyle w:val="Heading1"/>
+      </w:pPr>
+      <w:r>
+        <w:t>5. Implementation Plan</w:t>
+      </w:r>
+    </w:p>
+    <w:p>
+      <w:pPr>
+        <w:pStyle w:val="Heading2"/>
+      </w:pPr>
+      <w:r>
+        <w:t>5.1 Phased Rollout Strategy</w:t>
+      </w:r>
+    </w:p>
+    <w:p>
+      <w:pPr>
+        <w:pStyle w:val="ListBullet"/>
+      </w:pPr>
+      <w:r>
+        <w:rPr>
+          <w:b/>
+        </w:rPr>
+        <w:t>Week 1-2 - Foundation and environments:</w:t>
+      </w:r>
+      <w:r>
+        <w:t xml:space="preserve"> Provision rg-railway-ticketing-dev, qa and prod through Bicep, establish the GitHub Actions pipeline, Azure SQL railwaydb schema baseline, Key Vault, Service Bus topic booking-events and Application Insights; advancement gate is a successful end-to-end pipeline run deploying a health-check service to DEV.</w:t>
+      </w:r>
+    </w:p>
+    <w:p>
+      <w:pPr>
+        <w:pStyle w:val="ListBullet"/>
+      </w:pPr>
+      <w:r>
+        <w:rPr>
+          <w:b/>
+        </w:rPr>
+        <w:t>Week 3-4 - Train Search and Availability (Feature 2999):</w:t>
+      </w:r>
+      <w:r>
+        <w:t xml:space="preserve"> Implement the schedule and seat-inventory schema, GET /api/v1/trains/search and class-level availability with Redis caching; advancement gate is User Stories 3000 and 3001 passing automated acceptance tests with 95th-percentile search latency under 500 milliseconds on cache hit.</w:t>
+      </w:r>
+    </w:p>
+    <w:p>
+      <w:pPr>
+        <w:pStyle w:val="ListBullet"/>
+      </w:pPr>
+      <w:r>
+        <w:rPr>
+          <w:b/>
+        </w:rPr>
+        <w:t>Week 5-7 - Booking and Passenger Management (Feature 3002):</w:t>
+      </w:r>
+      <w:r>
+        <w:t xml:space="preserve"> Implement passenger profiles, multi-passenger booking, pessimistic seat-inventory locking, idempotency and booking-reference generation; advancement gate is User Stories 3003 and 3004 passing, plus a concurrency test proving zero double-allocation under 100 simultaneous reservation attempts on the same seat class.</w:t>
+      </w:r>
+    </w:p>
+    <w:p>
+      <w:pPr>
+        <w:pStyle w:val="ListBullet"/>
+      </w:pPr>
+      <w:r>
+        <w:rPr>
+          <w:b/>
+        </w:rPr>
+        <w:t>Week 8-10 - Payments and Ticket Lifecycle (Feature 3005):</w:t>
+      </w:r>
+      <w:r>
+        <w:t xml:space="preserve"> Integrate the PSP payment intent, signed webhook verification, ticket issuance, cancellation and policy-based refund calculation with the 15-minute hold-expiry job; advancement gate is User Stories 3006 and 3007 passing, including the negative case where a failed payment leaves no confirmed ticket.</w:t>
+      </w:r>
+    </w:p>
+    <w:p>
+      <w:pPr>
+        <w:pStyle w:val="ListBullet"/>
+      </w:pPr>
+      <w:r>
+        <w:rPr>
+          <w:b/>
+        </w:rPr>
+        <w:t>Week 11-12 - Notifications and Support (Feature 3008):</w:t>
+      </w:r>
+      <w:r>
+        <w:t xml:space="preserve"> Implement Service Bus consumption, email and SMS templates for booking, cancellation and schedule change, and the support-request lifecycle from logging through tracking to closure; advancement gate is User Stories 3009 and 3010 passing with 99 percent of confirmations dispatched within 60 seconds.</w:t>
+      </w:r>
+    </w:p>
+    <w:p>
+      <w:pPr>
+        <w:pStyle w:val="ListBullet"/>
+      </w:pPr>
+      <w:r>
+        <w:rPr>
+          <w:b/>
+        </w:rPr>
+        <w:t>Week 13 - Hardening and security validation:</w:t>
+      </w:r>
+      <w:r>
+        <w:t xml:space="preserve"> Execute penetration testing, WAF tuning in prevention mode, Key Vault rotation verification, PII classification review and audit-log completeness checks; advancement gate is zero open high or critical findings.</w:t>
+      </w:r>
+    </w:p>
+    <w:p>
+      <w:pPr>
+        <w:pStyle w:val="ListBullet"/>
+      </w:pPr>
+      <w:r>
+        <w:rPr>
+          <w:b/>
+        </w:rPr>
+        <w:t>Week 14 - Performance and resilience validation:</w:t>
+      </w:r>
+      <w:r>
+        <w:t xml:space="preserve"> Run load tests at 500 concurrent search users and 100 bookings per minute, chaos-test PSP unavailability and Service Bus dead-lettering, and validate circuit-breaker and compensating-release behaviour; advancement gate is all Section 4.3 targets met.</w:t>
+      </w:r>
+    </w:p>
+    <w:p>
+      <w:pPr>
+        <w:pStyle w:val="ListBullet"/>
+      </w:pPr>
+      <w:r>
+        <w:rPr>
+          <w:b/>
+        </w:rPr>
+        <w:t>Week 15 - User acceptance and QA sign-off:</w:t>
+      </w:r>
+      <w:r>
+        <w:t xml:space="preserve"> Business stakeholders validate the eight User Stories against acceptance criteria in the QA environment; advancement gate is formal QA approval recorded on the Azure DevOps work items.</w:t>
+      </w:r>
+    </w:p>
+    <w:p>
+      <w:pPr>
+        <w:pStyle w:val="ListBullet"/>
+      </w:pPr>
+      <w:r>
+        <w:rPr>
+          <w:b/>
+        </w:rPr>
+        <w:t>Week 16 - Production pilot and general availability:</w:t>
+      </w:r>
+      <w:r>
+        <w:t xml:space="preserve"> Blue-green deployment to PROD with a limited-route pilot for 3 days under heightened monitoring, then full route enablement; advancement gate is zero Severity 1 incidents during the pilot window and successful rollback rehearsal evidence.</w:t>
+      </w:r>
+    </w:p>
+    <w:p>
+      <w:pPr>
+        <w:pStyle w:val="Heading2"/>
+      </w:pPr>
+      <w:r>
+        <w:t>5.2 Teams and Security Roles</w:t>
+      </w:r>
+    </w:p>
+    <w:p>
+      <w:pPr>
+        <w:pStyle w:val="ListBullet"/>
+      </w:pPr>
+      <w:r>
+        <w:rPr>
+          <w:b/>
+        </w:rPr>
+        <w:t>Product Owner / Business Analyst:</w:t>
+      </w:r>
+      <w:r>
+        <w:t xml:space="preserve"> Owns Epic 2998 and its Features and User Stories in Azure DevOps, approves acceptance criteria changes, and arbitrates refund-policy band values; holds Contributor access to work items and read-only access to the repository.</w:t>
+      </w:r>
+    </w:p>
+    <w:p>
+      <w:pPr>
+        <w:pStyle w:val="ListBullet"/>
+      </w:pPr>
+      <w:r>
+        <w:rPr>
+          <w:b/>
+        </w:rPr>
+        <w:t>Architect:</w:t>
+      </w:r>
+      <w:r>
+        <w:t xml:space="preserve"> Owns this System Design Document, the Mermaid and PNG diagrams in docs/architecture/epic-2998/, and all Architecture Decision Records; approves any deviation from the baseline stack and holds write access to the docs path.</w:t>
+      </w:r>
+    </w:p>
+    <w:p>
+      <w:pPr>
+        <w:pStyle w:val="ListBullet"/>
+      </w:pPr>
+      <w:r>
+        <w:rPr>
+          <w:b/>
+        </w:rPr>
+        <w:t>Backend engineering team (.NET 8):</w:t>
+      </w:r>
+      <w:r>
+        <w:t xml:space="preserve"> Owns the Search, Booking, Payment, Notification and Support services, their database migrations and their unit and integration tests; holds Contributor role in DEV, read-only in PROD, with no standing access to production secrets.</w:t>
+      </w:r>
+    </w:p>
+    <w:p>
+      <w:pPr>
+        <w:pStyle w:val="ListBullet"/>
+      </w:pPr>
+      <w:r>
+        <w:rPr>
+          <w:b/>
+        </w:rPr>
+        <w:t>Frontend engineering team (React / TypeScript):</w:t>
+      </w:r>
+      <w:r>
+        <w:t xml:space="preserve"> Owns the single-page application, token handling, accessibility compliance and client-side validation; holds the same environment scopes as the backend team and must never persist tokens outside secure browser storage.</w:t>
+      </w:r>
+    </w:p>
+    <w:p>
+      <w:pPr>
+        <w:pStyle w:val="ListBullet"/>
+      </w:pPr>
+      <w:r>
+        <w:rPr>
+          <w:b/>
+        </w:rPr>
+        <w:t>Platform / DevOps engineer:</w:t>
+      </w:r>
+      <w:r>
+        <w:t xml:space="preserve"> Owns Bicep infrastructure modules, GitHub Actions pipelines, Azure Container Registry, private endpoints and the deployment service principal; is the only role permitted to change production infrastructure, and all changes flow through pull requests.</w:t>
+      </w:r>
+    </w:p>
+    <w:p>
+      <w:pPr>
+        <w:pStyle w:val="ListBullet"/>
+      </w:pPr>
+      <w:r>
+        <w:rPr>
+          <w:b/>
+        </w:rPr>
+        <w:t>Security engineer:</w:t>
+      </w:r>
+      <w:r>
+        <w:t xml:space="preserve"> Owns WAF rules, Key Vault policies, secret rotation, penetration-test scheduling and PCI DSS SAQ-A scope assertions; holds Security Reader plus Key Vault Administrator in non-production and break-glass-only access in production.</w:t>
+      </w:r>
+    </w:p>
+    <w:p>
+      <w:pPr>
+        <w:pStyle w:val="ListBullet"/>
+      </w:pPr>
+      <w:r>
+        <w:rPr>
+          <w:b/>
+        </w:rPr>
+        <w:t>QA lead and QA engineers:</w:t>
+      </w:r>
+      <w:r>
+        <w:t xml:space="preserve"> Own the automation suites, coverage gates, performance benchmarks and defect-severity triage; approve promotion from DEV to QA and provide the sign-off required before the Release Manager approves PROD.</w:t>
+      </w:r>
+    </w:p>
+    <w:p>
+      <w:pPr>
+        <w:pStyle w:val="ListBullet"/>
+      </w:pPr>
+      <w:r>
+        <w:rPr>
+          <w:b/>
+        </w:rPr>
+        <w:t>Release manager:</w:t>
+      </w:r>
+      <w:r>
+        <w:t xml:space="preserve"> Approves production deployments and change records, owns the maintenance window Sundays 02:00-04:00 UTC and authorises rollback or slot swap-back decisions during incidents.</w:t>
+      </w:r>
+    </w:p>
+    <w:p>
+      <w:pPr>
+        <w:pStyle w:val="ListBullet"/>
+      </w:pPr>
+      <w:r>
+        <w:rPr>
+          <w:b/>
+        </w:rPr>
+        <w:t>Site reliability / on-call engineer:</w:t>
+      </w:r>
+      <w:r>
+        <w:t xml:space="preserve"> Owns Application Insights alert rules, dead-letter-queue monitoring, incident response against the Section 4.3 escalation SLAs, and quarterly restore-drill execution; escalates Severity 1 payment or booking failures within 15 minutes.</w:t>
+      </w:r>
+    </w:p>
+    <w:p>
+      <w:pPr>
+        <w:pStyle w:val="ListBullet"/>
+      </w:pPr>
+      <w:r>
+        <w:rPr>
+          <w:b/>
+        </w:rPr>
+        <w:t>Support agents (business role):</w:t>
+      </w:r>
+      <w:r>
+        <w:t xml:space="preserve"> Operate the Support Service created for User Story 3010 with the SupportAgent role, able to read passenger bookings for the purpose of resolving requests and to update support-ticket status, with every access written to the immutable audit log.</w:t>
+      </w:r>
+    </w:p>
+    <w:p/>
+    <w:p>
+      <w:pPr>
+        <w:pStyle w:val="Heading1"/>
+      </w:pPr>
+      <w:r>
+        <w:t>6. Effort &amp; Schedule Estimation</w:t>
+      </w:r>
+    </w:p>
+    <w:p>
+      <w:pPr>
+        <w:pStyle w:val="Heading2"/>
+      </w:pPr>
+      <w:r>
+        <w:t>6.1 Estimation Approach</w:t>
+      </w:r>
+    </w:p>
+    <w:p>
+      <w:r>
+        <w:t>Estimation combines story points, T-shirt sizing and three-point (Optimistic/Realistic/Pessimistic) analysis so that both relative complexity and schedule risk are visible to stakeholders. Each of the eight User Stories under Epic 2998 is sized in story points on a modified Fibonacci scale, each of the four Features is given a T-shirt size, and the overall Epic is bounded by a three-point estimate that explicitly accounts for external payment-provider dependency risk.</w:t>
+      </w:r>
+    </w:p>
+    <w:p>
+      <w:r>
+        <w:t>Feature-level T-shirt sizing: Train Search and Availability (Feature 2999) is Medium; Booking and Passenger Management (Feature 3002) is Large because of seat-inventory concurrency control; Payments and Ticket Lifecycle (Feature 3005) is Large because of PSP integration, webhook verification and refund policy; Notifications and Support (Feature 3008) is Medium. Story-point allocation is: 8 points for Search trains between stations (3000), 5 for View seat availability (3001), 13 for Book railway tickets (3003), 5 for Manage passenger profiles (3004), 13 for Pay for bookings (3006), 8 for Cancel tickets and receive refunds (3007), 5 for Receive booking notifications (3009) and 5 for Raise support requests (3010) - a total of 62 story points.</w:t>
+      </w:r>
+    </w:p>
+    <w:p>
+      <w:r>
+        <w:t>The three-point estimate for the full Epic is: Optimistic 13 weeks, Realistic 16 weeks, Pessimistic 21 weeks, giving a PERT-weighted expectation of approximately 16.3 weeks. The pessimistic branch is driven mainly by payment-provider certification delays and by any late change to refund-policy bands, both of which are tracked as dependencies in Section 7.2. A team velocity of approximately 20 story points per two-week sprint across two paired squads underpins the realistic case.</w:t>
+      </w:r>
+    </w:p>
+    <w:p>
+      <w:pPr>
+        <w:pStyle w:val="Heading2"/>
+      </w:pPr>
+      <w:r>
+        <w:t>6.2 Timeline &amp; Milestones</w:t>
+      </w:r>
+    </w:p>
+    <w:p>
+      <w:pPr>
+        <w:pStyle w:val="ListBullet"/>
+      </w:pPr>
+      <w:r>
+        <w:rPr>
+          <w:b/>
+        </w:rPr>
+        <w:t>Milestone M1 - Platform foundation ready (Week 1 to Week 2):</w:t>
+      </w:r>
+      <w:r>
+        <w:t xml:space="preserve"> Environments, pipeline and data baseline complete; no inbound dependency; it is on the critical path because every subsequent Feature deploys through this pipeline.</w:t>
+      </w:r>
+    </w:p>
+    <w:p>
+      <w:pPr>
+        <w:pStyle w:val="ListBullet"/>
+      </w:pPr>
+      <w:r>
+        <w:rPr>
+          <w:b/>
+        </w:rPr>
+        <w:t>Milestone M2 - Search and availability live in QA (Week 3 to Week 4):</w:t>
+      </w:r>
+      <w:r>
+        <w:t xml:space="preserve"> Depends on M1; delivers User Stories 3000 and 3001; partially parallelisable with early Booking design work, so a one-week slip here consumes float rather than schedule.</w:t>
+      </w:r>
+    </w:p>
+    <w:p>
+      <w:pPr>
+        <w:pStyle w:val="ListBullet"/>
+      </w:pPr>
+      <w:r>
+        <w:rPr>
+          <w:b/>
+        </w:rPr>
+        <w:t>Milestone M3 - Booking and passenger profiles complete (Week 5 to Week 7):</w:t>
+      </w:r>
+      <w:r>
+        <w:t xml:space="preserve"> Depends on M2 for inventory contracts; delivers User Stories 3003 and 3004; sits on the critical path because payment work cannot be validated end to end without a reservable booking.</w:t>
+      </w:r>
+    </w:p>
+    <w:p>
+      <w:pPr>
+        <w:pStyle w:val="ListBullet"/>
+      </w:pPr>
+      <w:r>
+        <w:rPr>
+          <w:b/>
+        </w:rPr>
+        <w:t>Milestone M4 - Payments, tickets, cancellations and refunds complete (Week 8 to Week 10):</w:t>
+      </w:r>
+      <w:r>
+        <w:t xml:space="preserve"> Depends on M3 and on PSP sandbox credentials being available by Week 7; delivers User Stories 3006 and 3007; this is the highest-risk critical-path item and carries the pessimistic-case exposure.</w:t>
+      </w:r>
+    </w:p>
+    <w:p>
+      <w:pPr>
+        <w:pStyle w:val="ListBullet"/>
+      </w:pPr>
+      <w:r>
+        <w:rPr>
+          <w:b/>
+        </w:rPr>
+        <w:t>Milestone M5 - Notifications, support, hardening and go-live (Week 11 to Week 16):</w:t>
+      </w:r>
+      <w:r>
+        <w:t xml:space="preserve"> Depends on M4 for booking events; delivers User Stories 3009 and 3010, then security, performance, user acceptance testing and the production pilot, closing with general availability in Week 16.</w:t>
+      </w:r>
+    </w:p>
+    <w:p>
+      <w:pPr>
+        <w:pStyle w:val="Heading1"/>
+      </w:pPr>
+      <w:r>
+        <w:t>7. Assumptions &amp; Dependencies</w:t>
+      </w:r>
+    </w:p>
+    <w:p>
+      <w:pPr>
+        <w:pStyle w:val="Heading2"/>
+      </w:pPr>
+      <w:r>
+        <w:t>7.1 Assumptions</w:t>
+      </w:r>
+    </w:p>
+    <w:p>
+      <w:r>
+        <w:t>The backlog for Epic 2998 defines capabilities but not every technical particular, so the following assumptions are stated explicitly to de-risk ambiguity. Azure is the hosting platform and the baseline stack of React with TypeScript on the front end and .NET 8 ASP.NET Core on the back end applies, because no Feature or User Story specifies an alternative. A tokenised payment service provider with signed webhook settlement is assumed, since User Story 3006 names only supported payment methods and not a vendor; no raw card data is stored by the platform under any circumstance.</w:t>
+      </w:r>
+    </w:p>
+    <w:p>
+      <w:r>
+        <w:t>Refund rules referenced by User Story 3007 are assumed to be a configurable table of hours-before-departure bands mapped to refund percentages, maintained by the business rather than hard-coded, because the acceptance criterion states only that refunds are calculated per policy. Train, route, schedule and fare master data are assumed to arrive from an operator timetable feed loaded into the platform's schedule store, since no authoring capability appears in the backlog. Seat availability is assumed to be tracked at train, date and travel-class granularity rather than individual seat numbers, matching the wording of User Story 3001 that availability is displayed by travel class; if berth-level allocation is later required it is a change request against Feature 2999.</w:t>
+      </w:r>
+    </w:p>
+    <w:p>
+      <w:r>
+        <w:t>Notification channels are assumed to be email and SMS as stated in User Story 3009, with no push-notification channel in this release. A maximum of 6 passengers per booking and a 15-minute seat-hold window are assumed operational defaults held in configuration. Support requests under User Story 3010 are assumed to be handled in-platform by agents holding the SupportAgent role rather than federated to an external customer-relationship-management system.</w:t>
+      </w:r>
+    </w:p>
+    <w:p>
+      <w:pPr>
+        <w:pStyle w:val="Heading2"/>
+      </w:pPr>
+      <w:r>
+        <w:t>7.2 External Dependencies</w:t>
+      </w:r>
+    </w:p>
+    <w:p>
+      <w:r>
+        <w:t>The payment service provider is the most significant external dependency: sandbox credentials are required by Week 7 and production credentials plus webhook endpoint allow-listing by Week 14, with provider availability directly bounding the 99.95 percent settlement-processing target. The email and SMS provider is required from Week 11, including sender-identity verification and SMS sender registration, which in several jurisdictions carries a multi-week lead time and is therefore started in Week 8.</w:t>
+      </w:r>
+    </w:p>
+    <w:p>
+      <w:r>
+        <w:t>The railway operator timetable feed is a data dependency owned outside the delivery team and must be available in a stable format by Week 3 for Feature 2999; a static seeded dataset is the agreed contingency so search development is never blocked. Azure platform services - SQL Database, Cache for Redis, Service Bus, Key Vault, Application Insights and Application Gateway - are consumed under Microsoft service level agreements, and the composite availability of these services bounds the 99.9 percent application target. Internal dependencies include the security team for penetration testing in Week 13 and the Release Manager for the production change approval in Week 16.</w:t>
+      </w:r>
+    </w:p>
+    <w:p>
+      <w:pPr>
+        <w:pStyle w:val="Heading1"/>
+      </w:pPr>
+      <w:r>
+        <w:t>8. Appendices</w:t>
+      </w:r>
+    </w:p>
+    <w:p>
+      <w:pPr>
+        <w:pStyle w:val="Heading2"/>
+      </w:pPr>
+      <w:r>
+        <w:t>8.1 Additional Diagrams</w:t>
+      </w:r>
+    </w:p>
+    <w:p>
+      <w:pPr>
+        <w:jc w:val="center"/>
+      </w:pPr>
+      <w:r>
+        <w:drawing>
+          <wp:inline xmlns:a="http://schemas.openxmlformats.org/drawingml/2006/main" xmlns:pic="http://schemas.openxmlformats.org/drawingml/2006/picture">
+            <wp:extent cx="5760720" cy="484721"/>
+            <wp:docPr id="5" name="Picture 5"/>
+            <wp:cNvGraphicFramePr>
+              <a:graphicFrameLocks noChangeAspect="1"/>
+            </wp:cNvGraphicFramePr>
+            <a:graphic>
+              <a:graphicData uri="http://schemas.openxmlformats.org/drawingml/2006/picture">
+                <pic:pic>
+                  <pic:nvPicPr>
+                    <pic:cNvPr id="0" name="image.png"/>
+                    <pic:cNvPicPr/>
+                  </pic:nvPicPr>
+                  <pic:blipFill>
+                    <a:blip r:embed="rId10"/>
+                    <a:stretch>
+                      <a:fillRect/>
+                    </a:stretch>
+                  </pic:blipFill>
+                  <pic:spPr>
+                    <a:xfrm>
+                      <a:off x="0" y="0"/>
+                      <a:ext cx="5760720" cy="484721"/>
+                    </a:xfrm>
+                    <a:prstGeom prst="rect"/>
+                  </pic:spPr>
+                </pic:pic>
+              </a:graphicData>
+            </a:graphic>
+          </wp:inline>
+        </w:drawing>
+      </w:r>
+    </w:p>
+    <w:p>
+      <w:pPr>
+        <w:jc w:val="center"/>
+      </w:pPr>
+      <w:r>
+        <w:rPr>
+          <w:b/>
+          <w:i/>
           <w:sz w:val="18"/>
         </w:rPr>
-        <w:t>feature/story-&lt;id&gt;</w:t>
+        <w:t>High-Level Flow</w:t>
+      </w:r>
+    </w:p>
+    <w:p>
+      <w:pPr>
+        <w:jc w:val="center"/>
+      </w:pPr>
+      <w:r>
+        <w:rPr>
+          <w:i/>
+          <w:color w:val="646464"/>
+          <w:sz w:val="16"/>
+        </w:rPr>
+        <w:t>Source artifact: docs/architecture/epic-2998/high-level-flow.png</w:t>
+      </w:r>
+    </w:p>
+    <w:p>
+      <w:r>
+        <w:rPr>
+          <w:b/>
+        </w:rPr>
+        <w:t>Caption:</w:t>
       </w:r>
       <w:r>
-        <w:t xml:space="preserve"> branch; the pipeline builds the .NET 8 API and React UI, runs unit and integration tests, executes CodeQL, dependency and secret scanning, publishes a semantically versioned artifact, deploys automatically to dev, promotes to test on a release-candidate tag after full regression, then requires release-manager approval before a production staging-slot smoke test and slot swap. Rollback is the reverse slot swap, targeted at under 10 minutes (Section 4.6).</w:t>
+        <w:t xml:space="preserve"> The high-level flow diagram shows the complete passenger request path for Epic 2998 - browser through Application Gateway and the API gateway to the Search, Booking, Payment, Notification and Support services, then to Azure SQL, Redis, Service Bus and the external payment and communications providers. It ties directly to the Epic description of searching trains, booking tickets, payments, ticket management, notifications and customer support.</w:t>
+      </w:r>
+    </w:p>
+    <w:p>
+      <w:pPr>
+        <w:jc w:val="center"/>
+      </w:pPr>
+      <w:r>
+        <w:drawing>
+          <wp:inline xmlns:a="http://schemas.openxmlformats.org/drawingml/2006/main" xmlns:pic="http://schemas.openxmlformats.org/drawingml/2006/picture">
+            <wp:extent cx="5760720" cy="484721"/>
+            <wp:docPr id="6" name="Picture 6"/>
+            <wp:cNvGraphicFramePr>
+              <a:graphicFrameLocks noChangeAspect="1"/>
+            </wp:cNvGraphicFramePr>
+            <a:graphic>
+              <a:graphicData uri="http://schemas.openxmlformats.org/drawingml/2006/picture">
+                <pic:pic>
+                  <pic:nvPicPr>
+                    <pic:cNvPr id="0" name="image.png"/>
+                    <pic:cNvPicPr/>
+                  </pic:nvPicPr>
+                  <pic:blipFill>
+                    <a:blip r:embed="rId10"/>
+                    <a:stretch>
+                      <a:fillRect/>
+                    </a:stretch>
+                  </pic:blipFill>
+                  <pic:spPr>
+                    <a:xfrm>
+                      <a:off x="0" y="0"/>
+                      <a:ext cx="5760720" cy="484721"/>
+                    </a:xfrm>
+                    <a:prstGeom prst="rect"/>
+                  </pic:spPr>
+                </pic:pic>
+              </a:graphicData>
+            </a:graphic>
+          </wp:inline>
+        </w:drawing>
+      </w:r>
+    </w:p>
+    <w:p>
+      <w:pPr>
+        <w:jc w:val="center"/>
+      </w:pPr>
+      <w:r>
+        <w:rPr>
+          <w:b/>
+          <w:i/>
+          <w:sz w:val="18"/>
+        </w:rPr>
+        <w:t>Deployment Diagram</w:t>
+      </w:r>
+    </w:p>
+    <w:p>
+      <w:pPr>
+        <w:jc w:val="center"/>
+      </w:pPr>
+      <w:r>
+        <w:rPr>
+          <w:i/>
+          <w:color w:val="646464"/>
+          <w:sz w:val="16"/>
+        </w:rPr>
+        <w:t>Source artifact: docs/architecture/epic-2998/deployment.png</w:t>
+      </w:r>
+    </w:p>
+    <w:p>
+      <w:r>
+        <w:rPr>
+          <w:b/>
+        </w:rPr>
+        <w:t>Caption:</w:t>
+      </w:r>
+      <w:r>
+        <w:t xml:space="preserve"> The deployment diagram shows the Azure topology including the WAF-enabled gateway, private-endpoint-isolated data services, Key Vault for secrets and Application Insights for telemetry, demonstrating how the Section 4.4 security controls are physically realised.</w:t>
+      </w:r>
+    </w:p>
+    <w:p>
+      <w:pPr>
+        <w:jc w:val="center"/>
+      </w:pPr>
+      <w:r>
+        <w:drawing>
+          <wp:inline xmlns:a="http://schemas.openxmlformats.org/drawingml/2006/main" xmlns:pic="http://schemas.openxmlformats.org/drawingml/2006/picture">
+            <wp:extent cx="5760720" cy="484721"/>
+            <wp:docPr id="7" name="Picture 7"/>
+            <wp:cNvGraphicFramePr>
+              <a:graphicFrameLocks noChangeAspect="1"/>
+            </wp:cNvGraphicFramePr>
+            <a:graphic>
+              <a:graphicData uri="http://schemas.openxmlformats.org/drawingml/2006/picture">
+                <pic:pic>
+                  <pic:nvPicPr>
+                    <pic:cNvPr id="0" name="image.png"/>
+                    <pic:cNvPicPr/>
+                  </pic:nvPicPr>
+                  <pic:blipFill>
+                    <a:blip r:embed="rId10"/>
+                    <a:stretch>
+                      <a:fillRect/>
+                    </a:stretch>
+                  </pic:blipFill>
+                  <pic:spPr>
+                    <a:xfrm>
+                      <a:off x="0" y="0"/>
+                      <a:ext cx="5760720" cy="484721"/>
+                    </a:xfrm>
+                    <a:prstGeom prst="rect"/>
+                  </pic:spPr>
+                </pic:pic>
+              </a:graphicData>
+            </a:graphic>
+          </wp:inline>
+        </w:drawing>
+      </w:r>
+    </w:p>
+    <w:p>
+      <w:pPr>
+        <w:jc w:val="center"/>
+      </w:pPr>
+      <w:r>
+        <w:rPr>
+          <w:b/>
+          <w:i/>
+          <w:sz w:val="18"/>
+        </w:rPr>
+        <w:t>CI/CD Pipeline</w:t>
+      </w:r>
+    </w:p>
+    <w:p>
+      <w:pPr>
+        <w:jc w:val="center"/>
+      </w:pPr>
+      <w:r>
+        <w:rPr>
+          <w:i/>
+          <w:color w:val="646464"/>
+          <w:sz w:val="16"/>
+        </w:rPr>
+        <w:t>Source artifact: docs/architecture/epic-2998/cicd-pipeline.png</w:t>
+      </w:r>
+    </w:p>
+    <w:p>
+      <w:r>
+        <w:rPr>
+          <w:b/>
+        </w:rPr>
+        <w:t>Caption:</w:t>
+      </w:r>
+      <w:r>
+        <w:t xml:space="preserve"> The CI/CD pipeline diagram shows the commit-to-production path with unit tests, coverage and security gates, DEV automatic deployment, QA and PROD approvals, blue-green release and monitored rollback, implementing the Section 4.6 release strategy.</w:t>
+      </w:r>
+    </w:p>
+    <w:p>
+      <w:pPr>
+        <w:jc w:val="center"/>
+      </w:pPr>
+      <w:r>
+        <w:drawing>
+          <wp:inline xmlns:a="http://schemas.openxmlformats.org/drawingml/2006/main" xmlns:pic="http://schemas.openxmlformats.org/drawingml/2006/picture">
+            <wp:extent cx="5760720" cy="484721"/>
+            <wp:docPr id="8" name="Picture 8"/>
+            <wp:cNvGraphicFramePr>
+              <a:graphicFrameLocks noChangeAspect="1"/>
+            </wp:cNvGraphicFramePr>
+            <a:graphic>
+              <a:graphicData uri="http://schemas.openxmlformats.org/drawingml/2006/picture">
+                <pic:pic>
+                  <pic:nvPicPr>
+                    <pic:cNvPr id="0" name="image.png"/>
+                    <pic:cNvPicPr/>
+                  </pic:nvPicPr>
+                  <pic:blipFill>
+                    <a:blip r:embed="rId10"/>
+                    <a:stretch>
+                      <a:fillRect/>
+                    </a:stretch>
+                  </pic:blipFill>
+                  <pic:spPr>
+                    <a:xfrm>
+                      <a:off x="0" y="0"/>
+                      <a:ext cx="5760720" cy="484721"/>
+                    </a:xfrm>
+                    <a:prstGeom prst="rect"/>
+                  </pic:spPr>
+                </pic:pic>
+              </a:graphicData>
+            </a:graphic>
+          </wp:inline>
+        </w:drawing>
+      </w:r>
+    </w:p>
+    <w:p>
+      <w:pPr>
+        <w:jc w:val="center"/>
+      </w:pPr>
+      <w:r>
+        <w:rPr>
+          <w:b/>
+          <w:i/>
+          <w:sz w:val="18"/>
+        </w:rPr>
+        <w:t>Data Model</w:t>
+      </w:r>
+    </w:p>
+    <w:p>
+      <w:pPr>
+        <w:jc w:val="center"/>
+      </w:pPr>
+      <w:r>
+        <w:rPr>
+          <w:i/>
+          <w:color w:val="646464"/>
+          <w:sz w:val="16"/>
+        </w:rPr>
+        <w:t>Source artifact: docs/architecture/epic-2998/data-model.png</w:t>
+      </w:r>
+    </w:p>
+    <w:p>
+      <w:r>
+        <w:rPr>
+          <w:b/>
+        </w:rPr>
+        <w:t>Caption:</w:t>
+      </w:r>
+      <w:r>
+        <w:t xml:space="preserve"> The entity-relationship diagram covers the core entities - Station, Train, Schedule, SeatInventory, PassengerProfile, Booking, Passenger, Ticket, Payment, Refund, Notification and SupportRequest - with primary keys, foreign keys, cardinalities and PII tagging on passenger contact and identity attributes.</w:t>
+      </w:r>
+    </w:p>
+    <w:p>
+      <w:r>
+        <w:rPr>
+          <w:b/>
+        </w:rPr>
+        <w:t>Fallback:</w:t>
+      </w:r>
+      <w:r>
+        <w:t xml:space="preserve"> If images cannot be rendered, the Mermaid sources for every diagram are committed alongside this document as system-context.mmd, solution-architecture.mmd, component-diagram.mmd, sequence-booking-payment.mmd, data-model.mmd, deployment.mmd, high-level-flow.mmd and cicd-pipeline.mmd in docs/architecture/epic-2998/.</w:t>
       </w:r>
     </w:p>
     <w:p>
@@ -2887,15 +1942,16 @@
         <w:tblLook w:firstColumn="1" w:firstRow="1" w:lastColumn="0" w:lastRow="0" w:noHBand="0" w:noVBand="1" w:val="04A0"/>
       </w:tblPr>
       <w:tblGrid>
-        <w:gridCol w:w="2520"/>
-        <w:gridCol w:w="2520"/>
-        <w:gridCol w:w="2520"/>
-        <w:gridCol w:w="2520"/>
+        <w:gridCol w:w="2016"/>
+        <w:gridCol w:w="2016"/>
+        <w:gridCol w:w="2016"/>
+        <w:gridCol w:w="2016"/>
+        <w:gridCol w:w="2016"/>
       </w:tblGrid>
       <w:tr>
         <w:tc>
           <w:tcPr>
-            <w:tcW w:type="dxa" w:w="2520"/>
+            <w:tcW w:type="dxa" w:w="2016"/>
             <w:shd w:fill="D9EAF7"/>
           </w:tcPr>
           <w:p>
@@ -2903,13 +1959,27 @@
               <w:rPr>
                 <w:b/>
               </w:rPr>
-              <w:t>Azure DevOps Item</w:t>
+              <w:t>Work Item</w:t>
             </w:r>
           </w:p>
         </w:tc>
         <w:tc>
           <w:tcPr>
-            <w:tcW w:type="dxa" w:w="2520"/>
+            <w:tcW w:type="dxa" w:w="2016"/>
+            <w:shd w:fill="D9EAF7"/>
+          </w:tcPr>
+          <w:p>
+            <w:r>
+              <w:rPr>
+                <w:b/>
+              </w:rPr>
+              <w:t>Type</w:t>
+            </w:r>
+          </w:p>
+        </w:tc>
+        <w:tc>
+          <w:tcPr>
+            <w:tcW w:type="dxa" w:w="2016"/>
             <w:shd w:fill="D9EAF7"/>
           </w:tcPr>
           <w:p>
@@ -2923,7 +1993,7 @@
         </w:tc>
         <w:tc>
           <w:tcPr>
-            <w:tcW w:type="dxa" w:w="2520"/>
+            <w:tcW w:type="dxa" w:w="2016"/>
             <w:shd w:fill="D9EAF7"/>
           </w:tcPr>
           <w:p>
@@ -2931,13 +2001,13 @@
               <w:rPr>
                 <w:b/>
               </w:rPr>
-              <w:t>Architecture Components</w:t>
+              <w:t>Primary Component</w:t>
             </w:r>
           </w:p>
         </w:tc>
         <w:tc>
           <w:tcPr>
-            <w:tcW w:type="dxa" w:w="2520"/>
+            <w:tcW w:type="dxa" w:w="2016"/>
             <w:shd w:fill="D9EAF7"/>
           </w:tcPr>
           <w:p>
@@ -2945,7 +2015,7 @@
               <w:rPr>
                 <w:b/>
               </w:rPr>
-              <w:t>Diagrams</w:t>
+              <w:t>Design Reference</w:t>
             </w:r>
           </w:p>
         </w:tc>
@@ -2953,17 +2023,27 @@
       <w:tr>
         <w:tc>
           <w:tcPr>
-            <w:tcW w:type="dxa" w:w="2520"/>
+            <w:tcW w:type="dxa" w:w="2016"/>
           </w:tcPr>
           <w:p>
             <w:r>
-              <w:t>Epic 2998</w:t>
+              <w:t>2998</w:t>
             </w:r>
           </w:p>
         </w:tc>
         <w:tc>
           <w:tcPr>
-            <w:tcW w:type="dxa" w:w="2520"/>
+            <w:tcW w:type="dxa" w:w="2016"/>
+          </w:tcPr>
+          <w:p>
+            <w:r>
+              <w:t>Epic</w:t>
+            </w:r>
+          </w:p>
+        </w:tc>
+        <w:tc>
+          <w:tcPr>
+            <w:tcW w:type="dxa" w:w="2016"/>
           </w:tcPr>
           <w:p>
             <w:r>
@@ -2973,21 +2053,21 @@
         </w:tc>
         <w:tc>
           <w:tcPr>
-            <w:tcW w:type="dxa" w:w="2520"/>
+            <w:tcW w:type="dxa" w:w="2016"/>
           </w:tcPr>
           <w:p>
             <w:r>
-              <w:t>Entire platform</w:t>
+              <w:t>Whole platform</w:t>
             </w:r>
           </w:p>
         </w:tc>
         <w:tc>
           <w:tcPr>
-            <w:tcW w:type="dxa" w:w="2520"/>
+            <w:tcW w:type="dxa" w:w="2016"/>
           </w:tcPr>
           <w:p>
             <w:r>
-              <w:t>All six</w:t>
+              <w:t>Sections 1-8</w:t>
             </w:r>
           </w:p>
         </w:tc>
@@ -2995,17 +2075,27 @@
       <w:tr>
         <w:tc>
           <w:tcPr>
-            <w:tcW w:type="dxa" w:w="2520"/>
+            <w:tcW w:type="dxa" w:w="2016"/>
           </w:tcPr>
           <w:p>
             <w:r>
-              <w:t>Feature 2999</w:t>
+              <w:t>2999</w:t>
             </w:r>
           </w:p>
         </w:tc>
         <w:tc>
           <w:tcPr>
-            <w:tcW w:type="dxa" w:w="2520"/>
+            <w:tcW w:type="dxa" w:w="2016"/>
+          </w:tcPr>
+          <w:p>
+            <w:r>
+              <w:t>Feature</w:t>
+            </w:r>
+          </w:p>
+        </w:tc>
+        <w:tc>
+          <w:tcPr>
+            <w:tcW w:type="dxa" w:w="2016"/>
           </w:tcPr>
           <w:p>
             <w:r>
@@ -3015,21 +2105,21 @@
         </w:tc>
         <w:tc>
           <w:tcPr>
-            <w:tcW w:type="dxa" w:w="2520"/>
+            <w:tcW w:type="dxa" w:w="2016"/>
           </w:tcPr>
           <w:p>
             <w:r>
-              <w:t>Train Search API, TrainSearchService, SeatAvailabilityService, TrainRepository</w:t>
+              <w:t>Search Service, Redis cache, Schedule store</w:t>
             </w:r>
           </w:p>
         </w:tc>
         <w:tc>
           <w:tcPr>
-            <w:tcW w:type="dxa" w:w="2520"/>
+            <w:tcW w:type="dxa" w:w="2016"/>
           </w:tcPr>
           <w:p>
             <w:r>
-              <w:t>System Context, Solution Architecture, Component, Sequence</w:t>
+              <w:t>2.1, 3.1, 5.1 Week 3-4</w:t>
             </w:r>
           </w:p>
         </w:tc>
@@ -3037,17 +2127,27 @@
       <w:tr>
         <w:tc>
           <w:tcPr>
-            <w:tcW w:type="dxa" w:w="2520"/>
+            <w:tcW w:type="dxa" w:w="2016"/>
           </w:tcPr>
           <w:p>
             <w:r>
-              <w:t>Story 3000</w:t>
+              <w:t>3000</w:t>
             </w:r>
           </w:p>
         </w:tc>
         <w:tc>
           <w:tcPr>
-            <w:tcW w:type="dxa" w:w="2520"/>
+            <w:tcW w:type="dxa" w:w="2016"/>
+          </w:tcPr>
+          <w:p>
+            <w:r>
+              <w:t>User Story</w:t>
+            </w:r>
+          </w:p>
+        </w:tc>
+        <w:tc>
+          <w:tcPr>
+            <w:tcW w:type="dxa" w:w="2016"/>
           </w:tcPr>
           <w:p>
             <w:r>
@@ -3057,21 +2157,21 @@
         </w:tc>
         <w:tc>
           <w:tcPr>
-            <w:tcW w:type="dxa" w:w="2520"/>
+            <w:tcW w:type="dxa" w:w="2016"/>
           </w:tcPr>
           <w:p>
             <w:r>
-              <w:t>`GET /api/trains/search`, TRAIN, TRAIN_SCHEDULE, STATION, SEAT_INVENTORY.Fare</w:t>
+              <w:t>GET /api/v1/trains/search</w:t>
             </w:r>
           </w:p>
         </w:tc>
         <w:tc>
           <w:tcPr>
-            <w:tcW w:type="dxa" w:w="2520"/>
+            <w:tcW w:type="dxa" w:w="2016"/>
           </w:tcPr>
           <w:p>
             <w:r>
-              <w:t>Sequence, Data Model</w:t>
+              <w:t>3.1, 4.3 latency targets</w:t>
             </w:r>
           </w:p>
         </w:tc>
@@ -3079,17 +2179,27 @@
       <w:tr>
         <w:tc>
           <w:tcPr>
-            <w:tcW w:type="dxa" w:w="2520"/>
+            <w:tcW w:type="dxa" w:w="2016"/>
           </w:tcPr>
           <w:p>
             <w:r>
-              <w:t>Story 3001</w:t>
+              <w:t>3001</w:t>
             </w:r>
           </w:p>
         </w:tc>
         <w:tc>
           <w:tcPr>
-            <w:tcW w:type="dxa" w:w="2520"/>
+            <w:tcW w:type="dxa" w:w="2016"/>
+          </w:tcPr>
+          <w:p>
+            <w:r>
+              <w:t>User Story</w:t>
+            </w:r>
+          </w:p>
+        </w:tc>
+        <w:tc>
+          <w:tcPr>
+            <w:tcW w:type="dxa" w:w="2016"/>
           </w:tcPr>
           <w:p>
             <w:r>
@@ -3099,21 +2209,21 @@
         </w:tc>
         <w:tc>
           <w:tcPr>
-            <w:tcW w:type="dxa" w:w="2520"/>
+            <w:tcW w:type="dxa" w:w="2016"/>
           </w:tcPr>
           <w:p>
             <w:r>
-              <w:t>`GET /api/schedules/{id}/availability`, SEAT_INVENTORY, TRAVEL_CLASS (no caching)</w:t>
+              <w:t>SeatInventory read with cache invalidation</w:t>
             </w:r>
           </w:p>
         </w:tc>
         <w:tc>
           <w:tcPr>
-            <w:tcW w:type="dxa" w:w="2520"/>
+            <w:tcW w:type="dxa" w:w="2016"/>
           </w:tcPr>
           <w:p>
             <w:r>
-              <w:t>Component, Data Model</w:t>
+              <w:t>3.1, 4.7 severity rules</w:t>
             </w:r>
           </w:p>
         </w:tc>
@@ -3121,17 +2231,27 @@
       <w:tr>
         <w:tc>
           <w:tcPr>
-            <w:tcW w:type="dxa" w:w="2520"/>
+            <w:tcW w:type="dxa" w:w="2016"/>
           </w:tcPr>
           <w:p>
             <w:r>
-              <w:t>Feature 3002</w:t>
+              <w:t>3002</w:t>
             </w:r>
           </w:p>
         </w:tc>
         <w:tc>
           <w:tcPr>
-            <w:tcW w:type="dxa" w:w="2520"/>
+            <w:tcW w:type="dxa" w:w="2016"/>
+          </w:tcPr>
+          <w:p>
+            <w:r>
+              <w:t>Feature</w:t>
+            </w:r>
+          </w:p>
+        </w:tc>
+        <w:tc>
+          <w:tcPr>
+            <w:tcW w:type="dxa" w:w="2016"/>
           </w:tcPr>
           <w:p>
             <w:r>
@@ -3141,21 +2261,21 @@
         </w:tc>
         <w:tc>
           <w:tcPr>
-            <w:tcW w:type="dxa" w:w="2520"/>
+            <w:tcW w:type="dxa" w:w="2016"/>
           </w:tcPr>
           <w:p>
             <w:r>
-              <w:t>Booking API, Passenger Profile API, BookingService, PassengerService</w:t>
+              <w:t>Booking Service, Azure SQL</w:t>
             </w:r>
           </w:p>
         </w:tc>
         <w:tc>
           <w:tcPr>
-            <w:tcW w:type="dxa" w:w="2520"/>
+            <w:tcW w:type="dxa" w:w="2016"/>
           </w:tcPr>
           <w:p>
             <w:r>
-              <w:t>Solution Architecture, Component</w:t>
+              <w:t>2.1, 3.1, 5.1 Week 5-7</w:t>
             </w:r>
           </w:p>
         </w:tc>
@@ -3163,17 +2283,27 @@
       <w:tr>
         <w:tc>
           <w:tcPr>
-            <w:tcW w:type="dxa" w:w="2520"/>
+            <w:tcW w:type="dxa" w:w="2016"/>
           </w:tcPr>
           <w:p>
             <w:r>
-              <w:t>Story 3003</w:t>
+              <w:t>3003</w:t>
             </w:r>
           </w:p>
         </w:tc>
         <w:tc>
           <w:tcPr>
-            <w:tcW w:type="dxa" w:w="2520"/>
+            <w:tcW w:type="dxa" w:w="2016"/>
+          </w:tcPr>
+          <w:p>
+            <w:r>
+              <w:t>User Story</w:t>
+            </w:r>
+          </w:p>
+        </w:tc>
+        <w:tc>
+          <w:tcPr>
+            <w:tcW w:type="dxa" w:w="2016"/>
           </w:tcPr>
           <w:p>
             <w:r>
@@ -3183,21 +2313,21 @@
         </w:tc>
         <w:tc>
           <w:tcPr>
-            <w:tcW w:type="dxa" w:w="2520"/>
+            <w:tcW w:type="dxa" w:w="2016"/>
           </w:tcPr>
           <w:p>
             <w:r>
-              <w:t>`POST /api/bookings`, transactional seat decrement, BookingReference, BOOKING_PASSENGER</w:t>
+              <w:t>POST /api/v1/bookings, booking reference</w:t>
             </w:r>
           </w:p>
         </w:tc>
         <w:tc>
           <w:tcPr>
-            <w:tcW w:type="dxa" w:w="2520"/>
+            <w:tcW w:type="dxa" w:w="2016"/>
           </w:tcPr>
           <w:p>
             <w:r>
-              <w:t>Sequence, Data Model</w:t>
+              <w:t>3.1, 4.5 orchestration</w:t>
             </w:r>
           </w:p>
         </w:tc>
@@ -3205,17 +2335,27 @@
       <w:tr>
         <w:tc>
           <w:tcPr>
-            <w:tcW w:type="dxa" w:w="2520"/>
+            <w:tcW w:type="dxa" w:w="2016"/>
           </w:tcPr>
           <w:p>
             <w:r>
-              <w:t>Story 3004</w:t>
+              <w:t>3004</w:t>
             </w:r>
           </w:p>
         </w:tc>
         <w:tc>
           <w:tcPr>
-            <w:tcW w:type="dxa" w:w="2520"/>
+            <w:tcW w:type="dxa" w:w="2016"/>
+          </w:tcPr>
+          <w:p>
+            <w:r>
+              <w:t>User Story</w:t>
+            </w:r>
+          </w:p>
+        </w:tc>
+        <w:tc>
+          <w:tcPr>
+            <w:tcW w:type="dxa" w:w="2016"/>
           </w:tcPr>
           <w:p>
             <w:r>
@@ -3225,21 +2365,21 @@
         </w:tc>
         <w:tc>
           <w:tcPr>
-            <w:tcW w:type="dxa" w:w="2520"/>
+            <w:tcW w:type="dxa" w:w="2016"/>
           </w:tcPr>
           <w:p>
             <w:r>
-              <w:t>`GET/POST/PUT /api/passenger-profiles`, PASSENGER_PROFILE, USER_ACCOUNT</w:t>
+              <w:t>/api/v1/passenger-profiles</w:t>
             </w:r>
           </w:p>
         </w:tc>
         <w:tc>
           <w:tcPr>
-            <w:tcW w:type="dxa" w:w="2520"/>
+            <w:tcW w:type="dxa" w:w="2016"/>
           </w:tcPr>
           <w:p>
             <w:r>
-              <w:t>Component, Data Model</w:t>
+              <w:t>3.1, 4.4 PII controls</w:t>
             </w:r>
           </w:p>
         </w:tc>
@@ -3247,17 +2387,27 @@
       <w:tr>
         <w:tc>
           <w:tcPr>
-            <w:tcW w:type="dxa" w:w="2520"/>
+            <w:tcW w:type="dxa" w:w="2016"/>
           </w:tcPr>
           <w:p>
             <w:r>
-              <w:t>Feature 3005</w:t>
+              <w:t>3005</w:t>
             </w:r>
           </w:p>
         </w:tc>
         <w:tc>
           <w:tcPr>
-            <w:tcW w:type="dxa" w:w="2520"/>
+            <w:tcW w:type="dxa" w:w="2016"/>
+          </w:tcPr>
+          <w:p>
+            <w:r>
+              <w:t>Feature</w:t>
+            </w:r>
+          </w:p>
+        </w:tc>
+        <w:tc>
+          <w:tcPr>
+            <w:tcW w:type="dxa" w:w="2016"/>
           </w:tcPr>
           <w:p>
             <w:r>
@@ -3267,21 +2417,21 @@
         </w:tc>
         <w:tc>
           <w:tcPr>
-            <w:tcW w:type="dxa" w:w="2520"/>
+            <w:tcW w:type="dxa" w:w="2016"/>
           </w:tcPr>
           <w:p>
             <w:r>
-              <w:t>Payment API, PaymentService, RefundService, Payment Gateway integration</w:t>
+              <w:t>Payment Service, PSP integration</w:t>
             </w:r>
           </w:p>
         </w:tc>
         <w:tc>
           <w:tcPr>
-            <w:tcW w:type="dxa" w:w="2520"/>
+            <w:tcW w:type="dxa" w:w="2016"/>
           </w:tcPr>
           <w:p>
             <w:r>
-              <w:t>Solution Architecture, Sequence, Deployment</w:t>
+              <w:t>2.1, 3.1, 5.1 Week 8-10</w:t>
             </w:r>
           </w:p>
         </w:tc>
@@ -3289,17 +2439,27 @@
       <w:tr>
         <w:tc>
           <w:tcPr>
-            <w:tcW w:type="dxa" w:w="2520"/>
+            <w:tcW w:type="dxa" w:w="2016"/>
           </w:tcPr>
           <w:p>
             <w:r>
-              <w:t>Story 3006</w:t>
+              <w:t>3006</w:t>
             </w:r>
           </w:p>
         </w:tc>
         <w:tc>
           <w:tcPr>
-            <w:tcW w:type="dxa" w:w="2520"/>
+            <w:tcW w:type="dxa" w:w="2016"/>
+          </w:tcPr>
+          <w:p>
+            <w:r>
+              <w:t>User Story</w:t>
+            </w:r>
+          </w:p>
+        </w:tc>
+        <w:tc>
+          <w:tcPr>
+            <w:tcW w:type="dxa" w:w="2016"/>
           </w:tcPr>
           <w:p>
             <w:r>
@@ -3309,21 +2469,21 @@
         </w:tc>
         <w:tc>
           <w:tcPr>
-            <w:tcW w:type="dxa" w:w="2520"/>
+            <w:tcW w:type="dxa" w:w="2016"/>
           </w:tcPr>
           <w:p>
             <w:r>
-              <w:t>`POST /api/payments`, idempotency key, confirm/release branch, PAYMENT</w:t>
+              <w:t>Payment intent and verified webhook</w:t>
             </w:r>
           </w:p>
         </w:tc>
         <w:tc>
           <w:tcPr>
-            <w:tcW w:type="dxa" w:w="2520"/>
+            <w:tcW w:type="dxa" w:w="2016"/>
           </w:tcPr>
           <w:p>
             <w:r>
-              <w:t>Sequence</w:t>
+              <w:t>3.1, 4.1, 4.5 compensations</w:t>
             </w:r>
           </w:p>
         </w:tc>
@@ -3331,17 +2491,27 @@
       <w:tr>
         <w:tc>
           <w:tcPr>
-            <w:tcW w:type="dxa" w:w="2520"/>
+            <w:tcW w:type="dxa" w:w="2016"/>
           </w:tcPr>
           <w:p>
             <w:r>
-              <w:t>Story 3007</w:t>
+              <w:t>3007</w:t>
             </w:r>
           </w:p>
         </w:tc>
         <w:tc>
           <w:tcPr>
-            <w:tcW w:type="dxa" w:w="2520"/>
+            <w:tcW w:type="dxa" w:w="2016"/>
+          </w:tcPr>
+          <w:p>
+            <w:r>
+              <w:t>User Story</w:t>
+            </w:r>
+          </w:p>
+        </w:tc>
+        <w:tc>
+          <w:tcPr>
+            <w:tcW w:type="dxa" w:w="2016"/>
           </w:tcPr>
           <w:p>
             <w:r>
@@ -3351,21 +2521,21 @@
         </w:tc>
         <w:tc>
           <w:tcPr>
-            <w:tcW w:type="dxa" w:w="2520"/>
+            <w:tcW w:type="dxa" w:w="2016"/>
           </w:tcPr>
           <w:p>
             <w:r>
-              <w:t>`POST /api/bookings/{ref}/cancel`, policy slabs, CANCELLATION.RefundStatus</w:t>
+              <w:t>Cancellation and refund-policy table</w:t>
             </w:r>
           </w:p>
         </w:tc>
         <w:tc>
           <w:tcPr>
-            <w:tcW w:type="dxa" w:w="2520"/>
+            <w:tcW w:type="dxa" w:w="2016"/>
           </w:tcPr>
           <w:p>
             <w:r>
-              <w:t>Data Model, Component</w:t>
+              <w:t>3.1, 4.2 business configuration</w:t>
             </w:r>
           </w:p>
         </w:tc>
@@ -3373,17 +2543,27 @@
       <w:tr>
         <w:tc>
           <w:tcPr>
-            <w:tcW w:type="dxa" w:w="2520"/>
+            <w:tcW w:type="dxa" w:w="2016"/>
           </w:tcPr>
           <w:p>
             <w:r>
-              <w:t>Feature 3008</w:t>
+              <w:t>3008</w:t>
             </w:r>
           </w:p>
         </w:tc>
         <w:tc>
           <w:tcPr>
-            <w:tcW w:type="dxa" w:w="2520"/>
+            <w:tcW w:type="dxa" w:w="2016"/>
+          </w:tcPr>
+          <w:p>
+            <w:r>
+              <w:t>Feature</w:t>
+            </w:r>
+          </w:p>
+        </w:tc>
+        <w:tc>
+          <w:tcPr>
+            <w:tcW w:type="dxa" w:w="2016"/>
           </w:tcPr>
           <w:p>
             <w:r>
@@ -3393,21 +2573,21 @@
         </w:tc>
         <w:tc>
           <w:tcPr>
-            <w:tcW w:type="dxa" w:w="2520"/>
+            <w:tcW w:type="dxa" w:w="2016"/>
           </w:tcPr>
           <w:p>
             <w:r>
-              <w:t>Notification API, Support API, outbox dispatcher</w:t>
+              <w:t>Notification Service, Support Service</w:t>
             </w:r>
           </w:p>
         </w:tc>
         <w:tc>
           <w:tcPr>
-            <w:tcW w:type="dxa" w:w="2520"/>
+            <w:tcW w:type="dxa" w:w="2016"/>
           </w:tcPr>
           <w:p>
             <w:r>
-              <w:t>Solution Architecture, Component</w:t>
+              <w:t>2.1, 5.1 Week 11-12</w:t>
             </w:r>
           </w:p>
         </w:tc>
@@ -3415,17 +2595,27 @@
       <w:tr>
         <w:tc>
           <w:tcPr>
-            <w:tcW w:type="dxa" w:w="2520"/>
+            <w:tcW w:type="dxa" w:w="2016"/>
           </w:tcPr>
           <w:p>
             <w:r>
-              <w:t>Story 3009</w:t>
+              <w:t>3009</w:t>
             </w:r>
           </w:p>
         </w:tc>
         <w:tc>
           <w:tcPr>
-            <w:tcW w:type="dxa" w:w="2520"/>
+            <w:tcW w:type="dxa" w:w="2016"/>
+          </w:tcPr>
+          <w:p>
+            <w:r>
+              <w:t>User Story</w:t>
+            </w:r>
+          </w:p>
+        </w:tc>
+        <w:tc>
+          <w:tcPr>
+            <w:tcW w:type="dxa" w:w="2016"/>
           </w:tcPr>
           <w:p>
             <w:r>
@@ -3435,21 +2625,21 @@
         </w:tc>
         <w:tc>
           <w:tcPr>
-            <w:tcW w:type="dxa" w:w="2520"/>
+            <w:tcW w:type="dxa" w:w="2016"/>
           </w:tcPr>
           <w:p>
             <w:r>
-              <w:t>NotificationService, three provider templates, NOTIFICATION.DeliveryStatus</w:t>
+              <w:t>Service Bus subscriber, email and SMS</w:t>
             </w:r>
           </w:p>
         </w:tc>
         <w:tc>
           <w:tcPr>
-            <w:tcW w:type="dxa" w:w="2520"/>
+            <w:tcW w:type="dxa" w:w="2016"/>
           </w:tcPr>
           <w:p>
             <w:r>
-              <w:t>System Context, Sequence</w:t>
+              <w:t>4.1, 4.5 dead-lettering</w:t>
             </w:r>
           </w:p>
         </w:tc>
@@ -3457,17 +2647,27 @@
       <w:tr>
         <w:tc>
           <w:tcPr>
-            <w:tcW w:type="dxa" w:w="2520"/>
+            <w:tcW w:type="dxa" w:w="2016"/>
           </w:tcPr>
           <w:p>
             <w:r>
-              <w:t>Story 3010</w:t>
+              <w:t>3010</w:t>
             </w:r>
           </w:p>
         </w:tc>
         <w:tc>
           <w:tcPr>
-            <w:tcW w:type="dxa" w:w="2520"/>
+            <w:tcW w:type="dxa" w:w="2016"/>
+          </w:tcPr>
+          <w:p>
+            <w:r>
+              <w:t>User Story</w:t>
+            </w:r>
+          </w:p>
+        </w:tc>
+        <w:tc>
+          <w:tcPr>
+            <w:tcW w:type="dxa" w:w="2016"/>
           </w:tcPr>
           <w:p>
             <w:r>
@@ -3477,21 +2677,21 @@
         </w:tc>
         <w:tc>
           <w:tcPr>
-            <w:tcW w:type="dxa" w:w="2520"/>
+            <w:tcW w:type="dxa" w:w="2016"/>
           </w:tcPr>
           <w:p>
             <w:r>
-              <w:t>`POST /api/support-requests`, SupportService, SUPPORT_REQUEST lifecycle, Support Agent role</w:t>
+              <w:t>Support Service, SupportAgent role</w:t>
             </w:r>
           </w:p>
         </w:tc>
         <w:tc>
           <w:tcPr>
-            <w:tcW w:type="dxa" w:w="2520"/>
+            <w:tcW w:type="dxa" w:w="2016"/>
           </w:tcPr>
           <w:p>
             <w:r>
-              <w:t>Component, Data Model</w:t>
+              <w:t>4.3 support SLA, 5.2 roles</w:t>
             </w:r>
           </w:p>
         </w:tc>
@@ -3502,226 +2702,14 @@
         <w:pStyle w:val="Heading2"/>
       </w:pPr>
       <w:r>
-        <w:t>8.3 Architecture Artifact Index</w:t>
+        <w:t>8.3 Glossary</w:t>
       </w:r>
     </w:p>
-    <w:tbl>
-      <w:tblPr>
-        <w:tblStyle w:val="TableGrid"/>
-        <w:tblW w:type="auto" w:w="0"/>
-        <w:tblLook w:firstColumn="1" w:firstRow="1" w:lastColumn="0" w:lastRow="0" w:noHBand="0" w:noVBand="1" w:val="04A0"/>
-      </w:tblPr>
-      <w:tblGrid>
-        <w:gridCol w:w="5040"/>
-        <w:gridCol w:w="5040"/>
-      </w:tblGrid>
-      <w:tr>
-        <w:tc>
-          <w:tcPr>
-            <w:tcW w:type="dxa" w:w="5040"/>
-            <w:shd w:fill="D9EAF7"/>
-          </w:tcPr>
-          <w:p>
-            <w:r>
-              <w:rPr>
-                <w:b/>
-              </w:rPr>
-              <w:t>Artifact</w:t>
-            </w:r>
-          </w:p>
-        </w:tc>
-        <w:tc>
-          <w:tcPr>
-            <w:tcW w:type="dxa" w:w="5040"/>
-            <w:shd w:fill="D9EAF7"/>
-          </w:tcPr>
-          <w:p>
-            <w:r>
-              <w:rPr>
-                <w:b/>
-              </w:rPr>
-              <w:t>Repository Path</w:t>
-            </w:r>
-          </w:p>
-        </w:tc>
-      </w:tr>
-      <w:tr>
-        <w:tc>
-          <w:tcPr>
-            <w:tcW w:type="dxa" w:w="5040"/>
-          </w:tcPr>
-          <w:p>
-            <w:r>
-              <w:t>System Context (PNG / Mermaid)</w:t>
-            </w:r>
-          </w:p>
-        </w:tc>
-        <w:tc>
-          <w:tcPr>
-            <w:tcW w:type="dxa" w:w="5040"/>
-          </w:tcPr>
-          <w:p>
-            <w:r>
-              <w:t>`docs/architecture/epic-2998/system-context.png` / `.mmd`</w:t>
-            </w:r>
-          </w:p>
-        </w:tc>
-      </w:tr>
-      <w:tr>
-        <w:tc>
-          <w:tcPr>
-            <w:tcW w:type="dxa" w:w="5040"/>
-          </w:tcPr>
-          <w:p>
-            <w:r>
-              <w:t>Solution Architecture (PNG / Mermaid)</w:t>
-            </w:r>
-          </w:p>
-        </w:tc>
-        <w:tc>
-          <w:tcPr>
-            <w:tcW w:type="dxa" w:w="5040"/>
-          </w:tcPr>
-          <w:p>
-            <w:r>
-              <w:t>`docs/architecture/epic-2998/solution-architecture.png` / `.mmd`</w:t>
-            </w:r>
-          </w:p>
-        </w:tc>
-      </w:tr>
-      <w:tr>
-        <w:tc>
-          <w:tcPr>
-            <w:tcW w:type="dxa" w:w="5040"/>
-          </w:tcPr>
-          <w:p>
-            <w:r>
-              <w:t>Component Diagram (PNG / Mermaid)</w:t>
-            </w:r>
-          </w:p>
-        </w:tc>
-        <w:tc>
-          <w:tcPr>
-            <w:tcW w:type="dxa" w:w="5040"/>
-          </w:tcPr>
-          <w:p>
-            <w:r>
-              <w:t>`docs/architecture/epic-2998/component-diagram.png` / `.mmd`</w:t>
-            </w:r>
-          </w:p>
-        </w:tc>
-      </w:tr>
-      <w:tr>
-        <w:tc>
-          <w:tcPr>
-            <w:tcW w:type="dxa" w:w="5040"/>
-          </w:tcPr>
-          <w:p>
-            <w:r>
-              <w:t>Sequence - Booking &amp; Payment (PNG / Mermaid)</w:t>
-            </w:r>
-          </w:p>
-        </w:tc>
-        <w:tc>
-          <w:tcPr>
-            <w:tcW w:type="dxa" w:w="5040"/>
-          </w:tcPr>
-          <w:p>
-            <w:r>
-              <w:t>`docs/architecture/epic-2998/sequence-booking-payment.png` / `.mmd`</w:t>
-            </w:r>
-          </w:p>
-        </w:tc>
-      </w:tr>
-      <w:tr>
-        <w:tc>
-          <w:tcPr>
-            <w:tcW w:type="dxa" w:w="5040"/>
-          </w:tcPr>
-          <w:p>
-            <w:r>
-              <w:t>Data Model (PNG / Mermaid)</w:t>
-            </w:r>
-          </w:p>
-        </w:tc>
-        <w:tc>
-          <w:tcPr>
-            <w:tcW w:type="dxa" w:w="5040"/>
-          </w:tcPr>
-          <w:p>
-            <w:r>
-              <w:t>`docs/architecture/epic-2998/data-model.png` / `.mmd`</w:t>
-            </w:r>
-          </w:p>
-        </w:tc>
-      </w:tr>
-      <w:tr>
-        <w:tc>
-          <w:tcPr>
-            <w:tcW w:type="dxa" w:w="5040"/>
-          </w:tcPr>
-          <w:p>
-            <w:r>
-              <w:t>Deployment (PNG / Mermaid)</w:t>
-            </w:r>
-          </w:p>
-        </w:tc>
-        <w:tc>
-          <w:tcPr>
-            <w:tcW w:type="dxa" w:w="5040"/>
-          </w:tcPr>
-          <w:p>
-            <w:r>
-              <w:t>`docs/architecture/epic-2998/deployment.png` / `.mmd`</w:t>
-            </w:r>
-          </w:p>
-        </w:tc>
-      </w:tr>
-      <w:tr>
-        <w:tc>
-          <w:tcPr>
-            <w:tcW w:type="dxa" w:w="5040"/>
-          </w:tcPr>
-          <w:p>
-            <w:r>
-              <w:t>System Design Document (Markdown)</w:t>
-            </w:r>
-          </w:p>
-        </w:tc>
-        <w:tc>
-          <w:tcPr>
-            <w:tcW w:type="dxa" w:w="5040"/>
-          </w:tcPr>
-          <w:p>
-            <w:r>
-              <w:t>`docs/architecture/epic-2998/System-Design-Document.md`</w:t>
-            </w:r>
-          </w:p>
-        </w:tc>
-      </w:tr>
-      <w:tr>
-        <w:tc>
-          <w:tcPr>
-            <w:tcW w:type="dxa" w:w="5040"/>
-          </w:tcPr>
-          <w:p>
-            <w:r>
-              <w:t>System Design Document (Word)</w:t>
-            </w:r>
-          </w:p>
-        </w:tc>
-        <w:tc>
-          <w:tcPr>
-            <w:tcW w:type="dxa" w:w="5040"/>
-          </w:tcPr>
-          <w:p>
-            <w:r>
-              <w:t>`docs/architecture/epic-2998/System-Design-Document.docx`</w:t>
-            </w:r>
-          </w:p>
-        </w:tc>
-      </w:tr>
-    </w:tbl>
+    <w:p>
+      <w:r>
+        <w:t>ADR - Architecture Decision Record. DTO - Data Transfer Object. JWT - JSON Web Token. PII - Personally Identifiable Information. PCI DSS - Payment Card Industry Data Security Standard. PSP - Payment Service Provider. RPO - Recovery Point Objective. RTO - Recovery Time Objective. SMS - Short Message Service. TLS - Transport Layer Security. WAF - Web Application Firewall.</w:t>
+      </w:r>
+    </w:p>
     <w:sectPr>
       <w:footerReference w:type="default" r:id="rId9"/>
       <w:pgSz w:w="12240" w:h="15840"/>

</xml_diff>